<commit_message>
docs: clean up role labels and weights, set font to 12pt, and render diagrams as PNGs
</commit_message>
<xml_diff>
--- a/org-management-presentation/PureBlooms_Developed_System_Documentation.docx
+++ b/org-management-presentation/PureBlooms_Developed_System_Documentation.docx
@@ -1019,7 +1019,7 @@
           <w:rFonts w:ascii="Times New Roman" w:hAnsi="Times New Roman"/>
           <w:b w:val="0"/>
           <w:i w:val="0"/>
-          <w:sz w:val="22"/>
+          <w:sz w:val="24"/>
         </w:rPr>
         <w:t xml:space="preserve">PureBlooms is a bespoke, containerized </w:t>
       </w:r>
@@ -1028,7 +1028,7 @@
           <w:rFonts w:ascii="Times New Roman" w:hAnsi="Times New Roman"/>
           <w:b/>
           <w:i w:val="0"/>
-          <w:sz w:val="22"/>
+          <w:sz w:val="24"/>
         </w:rPr>
         <w:t>Software and Information System</w:t>
       </w:r>
@@ -1037,7 +1037,7 @@
           <w:rFonts w:ascii="Times New Roman" w:hAnsi="Times New Roman"/>
           <w:b w:val="0"/>
           <w:i w:val="0"/>
-          <w:sz w:val="22"/>
+          <w:sz w:val="24"/>
         </w:rPr>
         <w:t xml:space="preserve"> designed for a local retail floral business. Small retail gifting shops often operate in a state of organizational disarray, relying on decentralized social media direct messages (DMs), manual ledger entries, and approximate inventory estimation. This operational fragmentation results in lost orders, double-booked stock, and untracked financial transactions, which directly violates the core principles of Organizational Management (OM).</w:t>
       </w:r>
@@ -1054,7 +1054,7 @@
           <w:rFonts w:ascii="Times New Roman" w:hAnsi="Times New Roman"/>
           <w:b w:val="0"/>
           <w:i w:val="0"/>
-          <w:sz w:val="22"/>
+          <w:sz w:val="24"/>
         </w:rPr>
         <w:t xml:space="preserve">To bridge this operational gap, the Agile IT Consultancy Team developed </w:t>
       </w:r>
@@ -1063,7 +1063,7 @@
           <w:rFonts w:ascii="Times New Roman" w:hAnsi="Times New Roman"/>
           <w:b/>
           <w:i w:val="0"/>
-          <w:sz w:val="22"/>
+          <w:sz w:val="24"/>
         </w:rPr>
         <w:t>PureBlooms</w:t>
       </w:r>
@@ -1072,7 +1072,7 @@
           <w:rFonts w:ascii="Times New Roman" w:hAnsi="Times New Roman"/>
           <w:b w:val="0"/>
           <w:i w:val="0"/>
-          <w:sz w:val="22"/>
+          <w:sz w:val="24"/>
         </w:rPr>
         <w:t>. Built on the Laravel MVC framework, styled with Tailwind CSS, and containerized using Docker, the system operates as a unified operational control panel. For customers, it offers a frictionless, low-cognitive-load web storefront with dynamic add-ons and a live order tracking pipeline. For administrators (sellers), it provides a real-time key performance indicator (KPI) dashboard, order processing pipelines, automated inventory stock alerts, and financial intelligence tools.</w:t>
       </w:r>
@@ -1089,7 +1089,7 @@
           <w:rFonts w:ascii="Times New Roman" w:hAnsi="Times New Roman"/>
           <w:b w:val="0"/>
           <w:i w:val="0"/>
-          <w:sz w:val="22"/>
+          <w:sz w:val="24"/>
         </w:rPr>
         <w:t>By integrating management theory directly into system features, PureBlooms enforces the four core management functions—</w:t>
       </w:r>
@@ -1098,7 +1098,7 @@
           <w:rFonts w:ascii="Times New Roman" w:hAnsi="Times New Roman"/>
           <w:b/>
           <w:i w:val="0"/>
-          <w:sz w:val="22"/>
+          <w:sz w:val="24"/>
         </w:rPr>
         <w:t>Planning, Organizing, Leading, and Controlling</w:t>
       </w:r>
@@ -1107,7 +1107,7 @@
           <w:rFonts w:ascii="Times New Roman" w:hAnsi="Times New Roman"/>
           <w:b w:val="0"/>
           <w:i w:val="0"/>
-          <w:sz w:val="22"/>
+          <w:sz w:val="24"/>
         </w:rPr>
         <w:t>—transforming chaotic workflows into structured, auditable business processes.</w:t>
       </w:r>
@@ -1124,7 +1124,7 @@
           <w:rFonts w:ascii="Times New Roman" w:hAnsi="Times New Roman"/>
           <w:b w:val="0"/>
           <w:i w:val="0"/>
-          <w:sz w:val="22"/>
+          <w:sz w:val="24"/>
         </w:rPr>
         <w:t>---</w:t>
       </w:r>
@@ -1175,7 +1175,7 @@
           <w:rFonts w:ascii="Times New Roman" w:hAnsi="Times New Roman"/>
           <w:b w:val="0"/>
           <w:i w:val="0"/>
-          <w:sz w:val="22"/>
+          <w:sz w:val="24"/>
         </w:rPr>
         <w:t xml:space="preserve">For the purpose of this project, the development team structured itself as an </w:t>
       </w:r>
@@ -1184,7 +1184,7 @@
           <w:rFonts w:ascii="Times New Roman" w:hAnsi="Times New Roman"/>
           <w:b/>
           <w:i w:val="0"/>
-          <w:sz w:val="22"/>
+          <w:sz w:val="24"/>
         </w:rPr>
         <w:t>Agile IT Consultancy Firm</w:t>
       </w:r>
@@ -1193,7 +1193,7 @@
           <w:rFonts w:ascii="Times New Roman" w:hAnsi="Times New Roman"/>
           <w:b w:val="0"/>
           <w:i w:val="0"/>
-          <w:sz w:val="22"/>
+          <w:sz w:val="24"/>
         </w:rPr>
         <w:t xml:space="preserve"> representing four key organizational departments:</w:t>
       </w:r>
@@ -1209,7 +1209,7 @@
           <w:rFonts w:ascii="Times New Roman" w:hAnsi="Times New Roman"/>
           <w:b/>
           <w:i w:val="0"/>
-          <w:sz w:val="22"/>
+          <w:sz w:val="24"/>
         </w:rPr>
         <w:t xml:space="preserve">1.  </w:t>
       </w:r>
@@ -1218,26 +1218,26 @@
           <w:rFonts w:ascii="Times New Roman" w:hAnsi="Times New Roman"/>
           <w:b w:val="0"/>
           <w:i w:val="0"/>
-          <w:sz w:val="22"/>
-        </w:rPr>
-      </w:r>
-      <w:r>
-        <w:rPr>
-          <w:rFonts w:ascii="Times New Roman" w:hAnsi="Times New Roman"/>
-          <w:b/>
-          <w:i w:val="0"/>
-          <w:sz w:val="22"/>
-        </w:rPr>
-        <w:t>Project Management (P1 &amp; P2):</w:t>
-      </w:r>
-      <w:r>
-        <w:rPr>
-          <w:rFonts w:ascii="Times New Roman" w:hAnsi="Times New Roman"/>
-          <w:b w:val="0"/>
-          <w:i w:val="0"/>
-          <w:sz w:val="22"/>
-        </w:rPr>
-        <w:t xml:space="preserve"> Responsible for coordinating system specifications, aligning project features with OM frameworks, and managing delivery timelines.</w:t>
+          <w:sz w:val="24"/>
+        </w:rPr>
+      </w:r>
+      <w:r>
+        <w:rPr>
+          <w:rFonts w:ascii="Times New Roman" w:hAnsi="Times New Roman"/>
+          <w:b/>
+          <w:i w:val="0"/>
+          <w:sz w:val="24"/>
+        </w:rPr>
+        <w:t>Project Management:</w:t>
+      </w:r>
+      <w:r>
+        <w:rPr>
+          <w:rFonts w:ascii="Times New Roman" w:hAnsi="Times New Roman"/>
+          <w:b w:val="0"/>
+          <w:i w:val="0"/>
+          <w:sz w:val="24"/>
+        </w:rPr>
+        <w:t xml:space="preserve"> Responsible for coordinating system specifications, aligning project features with OM frameworks, and managing delivery timelines (led by David and Ruth Joy).</w:t>
       </w:r>
     </w:p>
     <w:p>
@@ -1251,7 +1251,7 @@
           <w:rFonts w:ascii="Times New Roman" w:hAnsi="Times New Roman"/>
           <w:b/>
           <w:i w:val="0"/>
-          <w:sz w:val="22"/>
+          <w:sz w:val="24"/>
         </w:rPr>
         <w:t xml:space="preserve">2.  </w:t>
       </w:r>
@@ -1260,26 +1260,26 @@
           <w:rFonts w:ascii="Times New Roman" w:hAnsi="Times New Roman"/>
           <w:b w:val="0"/>
           <w:i w:val="0"/>
-          <w:sz w:val="22"/>
-        </w:rPr>
-      </w:r>
-      <w:r>
-        <w:rPr>
-          <w:rFonts w:ascii="Times New Roman" w:hAnsi="Times New Roman"/>
-          <w:b/>
-          <w:i w:val="0"/>
-          <w:sz w:val="22"/>
-        </w:rPr>
-        <w:t>Customer Relations (P3 &amp; P4):</w:t>
-      </w:r>
-      <w:r>
-        <w:rPr>
-          <w:rFonts w:ascii="Times New Roman" w:hAnsi="Times New Roman"/>
-          <w:b w:val="0"/>
-          <w:i w:val="0"/>
-          <w:sz w:val="22"/>
-        </w:rPr>
-        <w:t xml:space="preserve"> Focused on customer journey mapping, storefront user experience (UX), and front-end interface quality checks.</w:t>
+          <w:sz w:val="24"/>
+        </w:rPr>
+      </w:r>
+      <w:r>
+        <w:rPr>
+          <w:rFonts w:ascii="Times New Roman" w:hAnsi="Times New Roman"/>
+          <w:b/>
+          <w:i w:val="0"/>
+          <w:sz w:val="24"/>
+        </w:rPr>
+        <w:t>Customer Relations:</w:t>
+      </w:r>
+      <w:r>
+        <w:rPr>
+          <w:rFonts w:ascii="Times New Roman" w:hAnsi="Times New Roman"/>
+          <w:b w:val="0"/>
+          <w:i w:val="0"/>
+          <w:sz w:val="24"/>
+        </w:rPr>
+        <w:t xml:space="preserve"> Focused on customer journey mapping, storefront user experience (UX), and front-end interface quality checks (led by Brix and Ydel Letice).</w:t>
       </w:r>
     </w:p>
     <w:p>
@@ -1293,7 +1293,7 @@
           <w:rFonts w:ascii="Times New Roman" w:hAnsi="Times New Roman"/>
           <w:b/>
           <w:i w:val="0"/>
-          <w:sz w:val="22"/>
+          <w:sz w:val="24"/>
         </w:rPr>
         <w:t xml:space="preserve">3.  </w:t>
       </w:r>
@@ -1302,26 +1302,26 @@
           <w:rFonts w:ascii="Times New Roman" w:hAnsi="Times New Roman"/>
           <w:b w:val="0"/>
           <w:i w:val="0"/>
-          <w:sz w:val="22"/>
-        </w:rPr>
-      </w:r>
-      <w:r>
-        <w:rPr>
-          <w:rFonts w:ascii="Times New Roman" w:hAnsi="Times New Roman"/>
-          <w:b/>
-          <w:i w:val="0"/>
-          <w:sz w:val="22"/>
-        </w:rPr>
-        <w:t>Operations (P5 &amp; P6):</w:t>
-      </w:r>
-      <w:r>
-        <w:rPr>
-          <w:rFonts w:ascii="Times New Roman" w:hAnsi="Times New Roman"/>
-          <w:b w:val="0"/>
-          <w:i w:val="0"/>
-          <w:sz w:val="22"/>
-        </w:rPr>
-        <w:t xml:space="preserve"> Responsible for seller-side workflows, tracking administrative usability, verifying report calculations, and auditing inventory logic.</w:t>
+          <w:sz w:val="24"/>
+        </w:rPr>
+      </w:r>
+      <w:r>
+        <w:rPr>
+          <w:rFonts w:ascii="Times New Roman" w:hAnsi="Times New Roman"/>
+          <w:b/>
+          <w:i w:val="0"/>
+          <w:sz w:val="24"/>
+        </w:rPr>
+        <w:t>Operations:</w:t>
+      </w:r>
+      <w:r>
+        <w:rPr>
+          <w:rFonts w:ascii="Times New Roman" w:hAnsi="Times New Roman"/>
+          <w:b w:val="0"/>
+          <w:i w:val="0"/>
+          <w:sz w:val="24"/>
+        </w:rPr>
+        <w:t xml:space="preserve"> Responsible for seller-side workflows, tracking administrative usability, verifying report calculations, and auditing inventory logic (led by John Paul and Von Eiron).</w:t>
       </w:r>
     </w:p>
     <w:p>
@@ -1335,7 +1335,7 @@
           <w:rFonts w:ascii="Times New Roman" w:hAnsi="Times New Roman"/>
           <w:b/>
           <w:i w:val="0"/>
-          <w:sz w:val="22"/>
+          <w:sz w:val="24"/>
         </w:rPr>
         <w:t xml:space="preserve">4.  </w:t>
       </w:r>
@@ -1344,26 +1344,26 @@
           <w:rFonts w:ascii="Times New Roman" w:hAnsi="Times New Roman"/>
           <w:b w:val="0"/>
           <w:i w:val="0"/>
-          <w:sz w:val="22"/>
-        </w:rPr>
-      </w:r>
-      <w:r>
-        <w:rPr>
-          <w:rFonts w:ascii="Times New Roman" w:hAnsi="Times New Roman"/>
-          <w:b/>
-          <w:i w:val="0"/>
-          <w:sz w:val="22"/>
-        </w:rPr>
-        <w:t>Development (P7 &amp; P8):</w:t>
-      </w:r>
-      <w:r>
-        <w:rPr>
-          <w:rFonts w:ascii="Times New Roman" w:hAnsi="Times New Roman"/>
-          <w:b w:val="0"/>
-          <w:i w:val="0"/>
-          <w:sz w:val="22"/>
-        </w:rPr>
-        <w:t xml:space="preserve"> Focused on codebase maintenance, Laravel structure, database transaction safety, and non-functional security requirements.</w:t>
+          <w:sz w:val="24"/>
+        </w:rPr>
+      </w:r>
+      <w:r>
+        <w:rPr>
+          <w:rFonts w:ascii="Times New Roman" w:hAnsi="Times New Roman"/>
+          <w:b/>
+          <w:i w:val="0"/>
+          <w:sz w:val="24"/>
+        </w:rPr>
+        <w:t>Development:</w:t>
+      </w:r>
+      <w:r>
+        <w:rPr>
+          <w:rFonts w:ascii="Times New Roman" w:hAnsi="Times New Roman"/>
+          <w:b w:val="0"/>
+          <w:i w:val="0"/>
+          <w:sz w:val="24"/>
+        </w:rPr>
+        <w:t xml:space="preserve"> Focused on codebase maintenance, Laravel structure, database transaction safety, and non-functional security requirements (led by Aaron Jake and Novel).</w:t>
       </w:r>
     </w:p>
     <w:p>
@@ -1395,7 +1395,7 @@
           <w:rFonts w:ascii="Times New Roman" w:hAnsi="Times New Roman"/>
           <w:b w:val="0"/>
           <w:i w:val="0"/>
-          <w:sz w:val="22"/>
+          <w:sz w:val="24"/>
         </w:rPr>
         <w:t>The client is a local small-scale florist boutique. Previously, their sales process was entirely decentralized:</w:t>
       </w:r>
@@ -1411,7 +1411,7 @@
           <w:rFonts w:ascii="Times New Roman" w:hAnsi="Times New Roman"/>
           <w:b w:val="0"/>
           <w:i w:val="0"/>
-          <w:sz w:val="22"/>
+          <w:sz w:val="24"/>
         </w:rPr>
         <w:t xml:space="preserve">•  </w:t>
       </w:r>
@@ -1420,7 +1420,7 @@
           <w:rFonts w:ascii="Times New Roman" w:hAnsi="Times New Roman"/>
           <w:b w:val="0"/>
           <w:i w:val="0"/>
-          <w:sz w:val="22"/>
+          <w:sz w:val="24"/>
         </w:rPr>
         <w:t>Customers browsed generic images on social media.</w:t>
       </w:r>
@@ -1436,7 +1436,7 @@
           <w:rFonts w:ascii="Times New Roman" w:hAnsi="Times New Roman"/>
           <w:b w:val="0"/>
           <w:i w:val="0"/>
-          <w:sz w:val="22"/>
+          <w:sz w:val="24"/>
         </w:rPr>
         <w:t xml:space="preserve">•  </w:t>
       </w:r>
@@ -1445,7 +1445,7 @@
           <w:rFonts w:ascii="Times New Roman" w:hAnsi="Times New Roman"/>
           <w:b w:val="0"/>
           <w:i w:val="0"/>
-          <w:sz w:val="22"/>
+          <w:sz w:val="24"/>
         </w:rPr>
         <w:t>Orders were initiated via chat messages.</w:t>
       </w:r>
@@ -1461,7 +1461,7 @@
           <w:rFonts w:ascii="Times New Roman" w:hAnsi="Times New Roman"/>
           <w:b w:val="0"/>
           <w:i w:val="0"/>
-          <w:sz w:val="22"/>
+          <w:sz w:val="24"/>
         </w:rPr>
         <w:t xml:space="preserve">•  </w:t>
       </w:r>
@@ -1470,7 +1470,7 @@
           <w:rFonts w:ascii="Times New Roman" w:hAnsi="Times New Roman"/>
           <w:b w:val="0"/>
           <w:i w:val="0"/>
-          <w:sz w:val="22"/>
+          <w:sz w:val="24"/>
         </w:rPr>
         <w:t>Inventory updates were manual and reactive, leading to situations where items were sold but out of stock.</w:t>
       </w:r>
@@ -1486,7 +1486,7 @@
           <w:rFonts w:ascii="Times New Roman" w:hAnsi="Times New Roman"/>
           <w:b w:val="0"/>
           <w:i w:val="0"/>
-          <w:sz w:val="22"/>
+          <w:sz w:val="24"/>
         </w:rPr>
         <w:t xml:space="preserve">•  </w:t>
       </w:r>
@@ -1495,7 +1495,7 @@
           <w:rFonts w:ascii="Times New Roman" w:hAnsi="Times New Roman"/>
           <w:b w:val="0"/>
           <w:i w:val="0"/>
-          <w:sz w:val="22"/>
+          <w:sz w:val="24"/>
         </w:rPr>
         <w:t>Payments were made to a personal GCash number, requiring manual confirmation and manual entry in paper logs.</w:t>
       </w:r>
@@ -1511,7 +1511,7 @@
           <w:rFonts w:ascii="Times New Roman" w:hAnsi="Times New Roman"/>
           <w:b w:val="0"/>
           <w:i w:val="0"/>
-          <w:sz w:val="22"/>
+          <w:sz w:val="24"/>
         </w:rPr>
         <w:t xml:space="preserve">•  </w:t>
       </w:r>
@@ -1520,7 +1520,7 @@
           <w:rFonts w:ascii="Times New Roman" w:hAnsi="Times New Roman"/>
           <w:b w:val="0"/>
           <w:i w:val="0"/>
-          <w:sz w:val="22"/>
+          <w:sz w:val="24"/>
         </w:rPr>
         <w:t>Financial reporting was nonexistent, with revenue calculated from memory or chat search history.</w:t>
       </w:r>
@@ -1554,7 +1554,7 @@
           <w:rFonts w:ascii="Times New Roman" w:hAnsi="Times New Roman"/>
           <w:b w:val="0"/>
           <w:i w:val="0"/>
-          <w:sz w:val="22"/>
+          <w:sz w:val="24"/>
         </w:rPr>
         <w:t xml:space="preserve">In alignment with the final requirement guidelines, the developed system is classified under </w:t>
       </w:r>
@@ -1563,7 +1563,7 @@
           <w:rFonts w:ascii="Times New Roman" w:hAnsi="Times New Roman"/>
           <w:b/>
           <w:i w:val="0"/>
-          <w:sz w:val="22"/>
+          <w:sz w:val="24"/>
         </w:rPr>
         <w:t>Software and Information System</w:t>
       </w:r>
@@ -1572,7 +1572,7 @@
           <w:rFonts w:ascii="Times New Roman" w:hAnsi="Times New Roman"/>
           <w:b w:val="0"/>
           <w:i w:val="0"/>
-          <w:sz w:val="22"/>
+          <w:sz w:val="24"/>
         </w:rPr>
         <w:t>. It is a software application that collects, processes, stores, and distributes information to support decision-making, coordination, and control in a retail flower business.</w:t>
       </w:r>
@@ -1589,7 +1589,7 @@
           <w:rFonts w:ascii="Times New Roman" w:hAnsi="Times New Roman"/>
           <w:b w:val="0"/>
           <w:i w:val="0"/>
-          <w:sz w:val="22"/>
+          <w:sz w:val="24"/>
         </w:rPr>
         <w:t>---</w:t>
       </w:r>
@@ -1640,7 +1640,7 @@
           <w:rFonts w:ascii="Times New Roman" w:hAnsi="Times New Roman"/>
           <w:b w:val="0"/>
           <w:i w:val="0"/>
-          <w:sz w:val="22"/>
+          <w:sz w:val="24"/>
         </w:rPr>
         <w:t xml:space="preserve">The application uses the </w:t>
       </w:r>
@@ -1649,7 +1649,7 @@
           <w:rFonts w:ascii="Times New Roman" w:hAnsi="Times New Roman"/>
           <w:b/>
           <w:i w:val="0"/>
-          <w:sz w:val="22"/>
+          <w:sz w:val="24"/>
         </w:rPr>
         <w:t>Laravel</w:t>
       </w:r>
@@ -1658,7 +1658,7 @@
           <w:rFonts w:ascii="Times New Roman" w:hAnsi="Times New Roman"/>
           <w:b w:val="0"/>
           <w:i w:val="0"/>
-          <w:sz w:val="22"/>
+          <w:sz w:val="24"/>
         </w:rPr>
         <w:t xml:space="preserve"> PHP framework to enforce a strict Model-View-Controller architecture. This decouples business logic, data models, and presentation interfaces:</w:t>
       </w:r>
@@ -1674,7 +1674,7 @@
           <w:rFonts w:ascii="Times New Roman" w:hAnsi="Times New Roman"/>
           <w:b w:val="0"/>
           <w:i w:val="0"/>
-          <w:sz w:val="22"/>
+          <w:sz w:val="24"/>
         </w:rPr>
         <w:t xml:space="preserve">•  </w:t>
       </w:r>
@@ -1683,15 +1683,15 @@
           <w:rFonts w:ascii="Times New Roman" w:hAnsi="Times New Roman"/>
           <w:b w:val="0"/>
           <w:i w:val="0"/>
-          <w:sz w:val="22"/>
-        </w:rPr>
-      </w:r>
-      <w:r>
-        <w:rPr>
-          <w:rFonts w:ascii="Times New Roman" w:hAnsi="Times New Roman"/>
-          <w:b/>
-          <w:i w:val="0"/>
-          <w:sz w:val="22"/>
+          <w:sz w:val="24"/>
+        </w:rPr>
+      </w:r>
+      <w:r>
+        <w:rPr>
+          <w:rFonts w:ascii="Times New Roman" w:hAnsi="Times New Roman"/>
+          <w:b/>
+          <w:i w:val="0"/>
+          <w:sz w:val="24"/>
         </w:rPr>
         <w:t>Models (`app/Models/`):</w:t>
       </w:r>
@@ -1700,7 +1700,7 @@
           <w:rFonts w:ascii="Times New Roman" w:hAnsi="Times New Roman"/>
           <w:b w:val="0"/>
           <w:i w:val="0"/>
-          <w:sz w:val="22"/>
+          <w:sz w:val="24"/>
         </w:rPr>
         <w:t xml:space="preserve"> Define the database entities, relations, and business logic (e.g., `Order`, `Product`, `Addon`, `OrderItem`, `Setting`).</w:t>
       </w:r>
@@ -1716,7 +1716,7 @@
           <w:rFonts w:ascii="Times New Roman" w:hAnsi="Times New Roman"/>
           <w:b w:val="0"/>
           <w:i w:val="0"/>
-          <w:sz w:val="22"/>
+          <w:sz w:val="24"/>
         </w:rPr>
         <w:t xml:space="preserve">•  </w:t>
       </w:r>
@@ -1725,15 +1725,15 @@
           <w:rFonts w:ascii="Times New Roman" w:hAnsi="Times New Roman"/>
           <w:b w:val="0"/>
           <w:i w:val="0"/>
-          <w:sz w:val="22"/>
-        </w:rPr>
-      </w:r>
-      <w:r>
-        <w:rPr>
-          <w:rFonts w:ascii="Times New Roman" w:hAnsi="Times New Roman"/>
-          <w:b/>
-          <w:i w:val="0"/>
-          <w:sz w:val="22"/>
+          <w:sz w:val="24"/>
+        </w:rPr>
+      </w:r>
+      <w:r>
+        <w:rPr>
+          <w:rFonts w:ascii="Times New Roman" w:hAnsi="Times New Roman"/>
+          <w:b/>
+          <w:i w:val="0"/>
+          <w:sz w:val="24"/>
         </w:rPr>
         <w:t>Views (`resources/views/`):</w:t>
       </w:r>
@@ -1742,7 +1742,7 @@
           <w:rFonts w:ascii="Times New Roman" w:hAnsi="Times New Roman"/>
           <w:b w:val="0"/>
           <w:i w:val="0"/>
-          <w:sz w:val="22"/>
+          <w:sz w:val="24"/>
         </w:rPr>
         <w:t xml:space="preserve"> Built with Laravel Blade templates, rendering dynamic data styled with Tailwind CSS, and structured for accessibility.</w:t>
       </w:r>
@@ -1758,7 +1758,7 @@
           <w:rFonts w:ascii="Times New Roman" w:hAnsi="Times New Roman"/>
           <w:b w:val="0"/>
           <w:i w:val="0"/>
-          <w:sz w:val="22"/>
+          <w:sz w:val="24"/>
         </w:rPr>
         <w:t xml:space="preserve">•  </w:t>
       </w:r>
@@ -1767,15 +1767,15 @@
           <w:rFonts w:ascii="Times New Roman" w:hAnsi="Times New Roman"/>
           <w:b w:val="0"/>
           <w:i w:val="0"/>
-          <w:sz w:val="22"/>
-        </w:rPr>
-      </w:r>
-      <w:r>
-        <w:rPr>
-          <w:rFonts w:ascii="Times New Roman" w:hAnsi="Times New Roman"/>
-          <w:b/>
-          <w:i w:val="0"/>
-          <w:sz w:val="22"/>
+          <w:sz w:val="24"/>
+        </w:rPr>
+      </w:r>
+      <w:r>
+        <w:rPr>
+          <w:rFonts w:ascii="Times New Roman" w:hAnsi="Times New Roman"/>
+          <w:b/>
+          <w:i w:val="0"/>
+          <w:sz w:val="24"/>
         </w:rPr>
         <w:t>Controllers (`app/Http/Controllers/`):</w:t>
       </w:r>
@@ -1784,70 +1784,67 @@
           <w:rFonts w:ascii="Times New Roman" w:hAnsi="Times New Roman"/>
           <w:b w:val="0"/>
           <w:i w:val="0"/>
-          <w:sz w:val="22"/>
+          <w:sz w:val="24"/>
         </w:rPr>
         <w:t xml:space="preserve"> Coordinate HTTP requests, validate input data, query models, and return appropriate views or JSON payloads.</w:t>
       </w:r>
     </w:p>
     <w:p>
       <w:pPr>
-        <w:spacing w:before="120" w:after="120" w:line="240" w:lineRule="auto"/>
-        <w:ind w:left="720"/>
-        <w:jc w:val="left"/>
-      </w:pPr>
-      <w:r>
-        <w:rPr>
-          <w:rFonts w:ascii="Consolas" w:hAnsi="Consolas"/>
-          <w:b w:val="0"/>
-          <w:i w:val="0"/>
+        <w:keepNext/>
+        <w:spacing w:before="240" w:after="80"/>
+        <w:jc w:val="center"/>
+      </w:pPr>
+      <w:r>
+        <w:drawing>
+          <wp:inline xmlns:a="http://schemas.openxmlformats.org/drawingml/2006/main">
+            <wp:extent cx="4572000" cy="7086014"/>
+            <wp:docPr id="1" name="Picture 1"/>
+            <wp:cNvGraphicFramePr>
+              <a:graphicFrameLocks noChangeAspect="1"/>
+            </wp:cNvGraphicFramePr>
+            <a:graphic>
+              <a:graphicData uri="http://schemas.openxmlformats.org/drawingml/2006/picture">
+                <pic:pic>
+                  <pic:nvPicPr>
+                    <pic:cNvPr id="0" name="mvc_diagram.png"/>
+                    <pic:cNvPicPr/>
+                  </pic:nvPicPr>
+                  <pic:blipFill>
+                    <a:blip r:embed="rId16"/>
+                    <a:stretch>
+                      <a:fillRect/>
+                    </a:stretch>
+                  </pic:blipFill>
+                  <pic:spPr>
+                    <a:xfrm>
+                      <a:off x="0" y="0"/>
+                      <a:ext cx="4572000" cy="7086014"/>
+                    </a:xfrm>
+                    <a:prstGeom prst="rect"/>
+                  </pic:spPr>
+                </pic:pic>
+              </a:graphicData>
+            </a:graphic>
+          </wp:inline>
+        </w:drawing>
+      </w:r>
+    </w:p>
+    <w:p>
+      <w:pPr>
+        <w:keepNext w:val="0"/>
+        <w:spacing w:before="40" w:after="240"/>
+        <w:jc w:val="center"/>
+      </w:pPr>
+      <w:r>
+        <w:rPr>
+          <w:rFonts w:ascii="Times New Roman" w:hAnsi="Times New Roman"/>
+          <w:b w:val="0"/>
+          <w:i/>
           <w:color w:val="505050"/>
-          <w:sz w:val="19"/>
-        </w:rPr>
-        <w:t xml:space="preserve">                  ┌────────────────────────────────────────┐</w:t>
-        <w:br/>
-        <w:t xml:space="preserve">                  │                Browser                 │</w:t>
-        <w:br/>
-        <w:t xml:space="preserve">                  └───────────┬────────────────▲───────────┘</w:t>
-        <w:br/>
-        <w:t xml:space="preserve">               HTTP Request   │                │   HTML / JSON</w:t>
-        <w:br/>
-        <w:t xml:space="preserve">                              ▼                │</w:t>
-        <w:br/>
-        <w:t xml:space="preserve">                  ┌────────────────────────────────────────┐</w:t>
-        <w:br/>
-        <w:t xml:space="preserve">                  │                 Router                 │</w:t>
-        <w:br/>
-        <w:t xml:space="preserve">                  └───────────┬────────────────────────────┘</w:t>
-        <w:br/>
-        <w:t xml:space="preserve">                              ▼</w:t>
-        <w:br/>
-        <w:t xml:space="preserve">                  ┌────────────────────────────────────────┐</w:t>
-        <w:br/>
-        <w:t xml:space="preserve">                  │               Controller               │</w:t>
-        <w:br/>
-        <w:t xml:space="preserve">                  └──────┬──────────────────────────▲──────┘</w:t>
-        <w:br/>
-        <w:t xml:space="preserve">                         │                          │</w:t>
-        <w:br/>
-        <w:t xml:space="preserve">           Read / Write  │                          │ Dynamic Data</w:t>
-        <w:br/>
-        <w:t xml:space="preserve">                         ▼                          │</w:t>
-        <w:br/>
-        <w:t xml:space="preserve">    ┌──────────────────────────┐      ┌─────────────┴──────────┐</w:t>
-        <w:br/>
-        <w:t xml:space="preserve">    │          Model           │      │          View          │</w:t>
-        <w:br/>
-        <w:t xml:space="preserve">    └────────────┬─────────────┘      │     (Blade Engine)     │</w:t>
-        <w:br/>
-        <w:t xml:space="preserve">                 │                    └────────────────────────┘</w:t>
-        <w:br/>
-        <w:t xml:space="preserve">                 ▼ Database Query</w:t>
-        <w:br/>
-        <w:t xml:space="preserve">    ┌──────────────────────────┐</w:t>
-        <w:br/>
-        <w:t xml:space="preserve">    │     SQLite Database      │</w:t>
-        <w:br/>
-        <w:t xml:space="preserve">    └──────────────────────────┘</w:t>
+          <w:sz w:val="20"/>
+        </w:rPr>
+        <w:t>Figure: MVC Architecture Diagram</w:t>
       </w:r>
     </w:p>
     <w:p>
@@ -1879,7 +1876,7 @@
           <w:rFonts w:ascii="Times New Roman" w:hAnsi="Times New Roman"/>
           <w:b w:val="0"/>
           <w:i w:val="0"/>
-          <w:sz w:val="22"/>
+          <w:sz w:val="24"/>
         </w:rPr>
         <w:t>The system is built on a clean database schema, designed to prevent data redundancy and maintain referential integrity.</w:t>
       </w:r>
@@ -1895,7 +1892,7 @@
           <w:rFonts w:ascii="Times New Roman" w:hAnsi="Times New Roman"/>
           <w:b/>
           <w:i w:val="0"/>
-          <w:sz w:val="22"/>
+          <w:sz w:val="24"/>
         </w:rPr>
         <w:t xml:space="preserve">1.  </w:t>
       </w:r>
@@ -1904,15 +1901,15 @@
           <w:rFonts w:ascii="Times New Roman" w:hAnsi="Times New Roman"/>
           <w:b w:val="0"/>
           <w:i w:val="0"/>
-          <w:sz w:val="22"/>
-        </w:rPr>
-      </w:r>
-      <w:r>
-        <w:rPr>
-          <w:rFonts w:ascii="Times New Roman" w:hAnsi="Times New Roman"/>
-          <w:b/>
-          <w:i w:val="0"/>
-          <w:sz w:val="22"/>
+          <w:sz w:val="24"/>
+        </w:rPr>
+      </w:r>
+      <w:r>
+        <w:rPr>
+          <w:rFonts w:ascii="Times New Roman" w:hAnsi="Times New Roman"/>
+          <w:b/>
+          <w:i w:val="0"/>
+          <w:sz w:val="24"/>
         </w:rPr>
         <w:t>`users` Table:</w:t>
       </w:r>
@@ -1921,7 +1918,7 @@
           <w:rFonts w:ascii="Times New Roman" w:hAnsi="Times New Roman"/>
           <w:b w:val="0"/>
           <w:i w:val="0"/>
-          <w:sz w:val="22"/>
+          <w:sz w:val="24"/>
         </w:rPr>
         <w:t xml:space="preserve"> Stores credential information, contact data, and the `role` field (`admin` vs. `customer`) to enforce access control.</w:t>
       </w:r>
@@ -1937,7 +1934,7 @@
           <w:rFonts w:ascii="Times New Roman" w:hAnsi="Times New Roman"/>
           <w:b/>
           <w:i w:val="0"/>
-          <w:sz w:val="22"/>
+          <w:sz w:val="24"/>
         </w:rPr>
         <w:t xml:space="preserve">2.  </w:t>
       </w:r>
@@ -1946,15 +1943,15 @@
           <w:rFonts w:ascii="Times New Roman" w:hAnsi="Times New Roman"/>
           <w:b w:val="0"/>
           <w:i w:val="0"/>
-          <w:sz w:val="22"/>
-        </w:rPr>
-      </w:r>
-      <w:r>
-        <w:rPr>
-          <w:rFonts w:ascii="Times New Roman" w:hAnsi="Times New Roman"/>
-          <w:b/>
-          <w:i w:val="0"/>
-          <w:sz w:val="22"/>
+          <w:sz w:val="24"/>
+        </w:rPr>
+      </w:r>
+      <w:r>
+        <w:rPr>
+          <w:rFonts w:ascii="Times New Roman" w:hAnsi="Times New Roman"/>
+          <w:b/>
+          <w:i w:val="0"/>
+          <w:sz w:val="24"/>
         </w:rPr>
         <w:t>`categories` Table:</w:t>
       </w:r>
@@ -1963,7 +1960,7 @@
           <w:rFonts w:ascii="Times New Roman" w:hAnsi="Times New Roman"/>
           <w:b w:val="0"/>
           <w:i w:val="0"/>
-          <w:sz w:val="22"/>
+          <w:sz w:val="24"/>
         </w:rPr>
         <w:t xml:space="preserve"> Groups products (e.g., Bouquets, Flower Baskets, Single Stems) and tracks active status (`is_active`).</w:t>
       </w:r>
@@ -1979,7 +1976,7 @@
           <w:rFonts w:ascii="Times New Roman" w:hAnsi="Times New Roman"/>
           <w:b/>
           <w:i w:val="0"/>
-          <w:sz w:val="22"/>
+          <w:sz w:val="24"/>
         </w:rPr>
         <w:t xml:space="preserve">3.  </w:t>
       </w:r>
@@ -1988,15 +1985,15 @@
           <w:rFonts w:ascii="Times New Roman" w:hAnsi="Times New Roman"/>
           <w:b w:val="0"/>
           <w:i w:val="0"/>
-          <w:sz w:val="22"/>
-        </w:rPr>
-      </w:r>
-      <w:r>
-        <w:rPr>
-          <w:rFonts w:ascii="Times New Roman" w:hAnsi="Times New Roman"/>
-          <w:b/>
-          <w:i w:val="0"/>
-          <w:sz w:val="22"/>
+          <w:sz w:val="24"/>
+        </w:rPr>
+      </w:r>
+      <w:r>
+        <w:rPr>
+          <w:rFonts w:ascii="Times New Roman" w:hAnsi="Times New Roman"/>
+          <w:b/>
+          <w:i w:val="0"/>
+          <w:sz w:val="24"/>
         </w:rPr>
         <w:t>`products` Table:</w:t>
       </w:r>
@@ -2005,7 +2002,7 @@
           <w:rFonts w:ascii="Times New Roman" w:hAnsi="Times New Roman"/>
           <w:b w:val="0"/>
           <w:i w:val="0"/>
-          <w:sz w:val="22"/>
+          <w:sz w:val="24"/>
         </w:rPr>
         <w:t xml:space="preserve"> Tracks product details, price (`decimal:2`), stock quantity (`integer`), and featured status (`is_featured`).</w:t>
       </w:r>
@@ -2021,7 +2018,7 @@
           <w:rFonts w:ascii="Times New Roman" w:hAnsi="Times New Roman"/>
           <w:b/>
           <w:i w:val="0"/>
-          <w:sz w:val="22"/>
+          <w:sz w:val="24"/>
         </w:rPr>
         <w:t xml:space="preserve">4.  </w:t>
       </w:r>
@@ -2030,15 +2027,15 @@
           <w:rFonts w:ascii="Times New Roman" w:hAnsi="Times New Roman"/>
           <w:b w:val="0"/>
           <w:i w:val="0"/>
-          <w:sz w:val="22"/>
-        </w:rPr>
-      </w:r>
-      <w:r>
-        <w:rPr>
-          <w:rFonts w:ascii="Times New Roman" w:hAnsi="Times New Roman"/>
-          <w:b/>
-          <w:i w:val="0"/>
-          <w:sz w:val="22"/>
+          <w:sz w:val="24"/>
+        </w:rPr>
+      </w:r>
+      <w:r>
+        <w:rPr>
+          <w:rFonts w:ascii="Times New Roman" w:hAnsi="Times New Roman"/>
+          <w:b/>
+          <w:i w:val="0"/>
+          <w:sz w:val="24"/>
         </w:rPr>
         <w:t>`addons` Table:</w:t>
       </w:r>
@@ -2047,7 +2044,7 @@
           <w:rFonts w:ascii="Times New Roman" w:hAnsi="Times New Roman"/>
           <w:b w:val="0"/>
           <w:i w:val="0"/>
-          <w:sz w:val="22"/>
+          <w:sz w:val="24"/>
         </w:rPr>
         <w:t xml:space="preserve"> Manages optional purchase enhancements (e.g., gift wrappers, custom greeting cards) with corresponding price modifiers.</w:t>
       </w:r>
@@ -2063,7 +2060,7 @@
           <w:rFonts w:ascii="Times New Roman" w:hAnsi="Times New Roman"/>
           <w:b/>
           <w:i w:val="0"/>
-          <w:sz w:val="22"/>
+          <w:sz w:val="24"/>
         </w:rPr>
         <w:t xml:space="preserve">5.  </w:t>
       </w:r>
@@ -2072,15 +2069,15 @@
           <w:rFonts w:ascii="Times New Roman" w:hAnsi="Times New Roman"/>
           <w:b w:val="0"/>
           <w:i w:val="0"/>
-          <w:sz w:val="22"/>
-        </w:rPr>
-      </w:r>
-      <w:r>
-        <w:rPr>
-          <w:rFonts w:ascii="Times New Roman" w:hAnsi="Times New Roman"/>
-          <w:b/>
-          <w:i w:val="0"/>
-          <w:sz w:val="22"/>
+          <w:sz w:val="24"/>
+        </w:rPr>
+      </w:r>
+      <w:r>
+        <w:rPr>
+          <w:rFonts w:ascii="Times New Roman" w:hAnsi="Times New Roman"/>
+          <w:b/>
+          <w:i w:val="0"/>
+          <w:sz w:val="24"/>
         </w:rPr>
         <w:t>`orders` Table:</w:t>
       </w:r>
@@ -2089,7 +2086,7 @@
           <w:rFonts w:ascii="Times New Roman" w:hAnsi="Times New Roman"/>
           <w:b w:val="0"/>
           <w:i w:val="0"/>
-          <w:sz w:val="22"/>
+          <w:sz w:val="24"/>
         </w:rPr>
         <w:t xml:space="preserve"> Holds transaction metadata, including order numbers, payment methods, delivery details, status tracking flags, and customer contact information.</w:t>
       </w:r>
@@ -2105,7 +2102,7 @@
           <w:rFonts w:ascii="Times New Roman" w:hAnsi="Times New Roman"/>
           <w:b/>
           <w:i w:val="0"/>
-          <w:sz w:val="22"/>
+          <w:sz w:val="24"/>
         </w:rPr>
         <w:t xml:space="preserve">6.  </w:t>
       </w:r>
@@ -2114,15 +2111,15 @@
           <w:rFonts w:ascii="Times New Roman" w:hAnsi="Times New Roman"/>
           <w:b w:val="0"/>
           <w:i w:val="0"/>
-          <w:sz w:val="22"/>
-        </w:rPr>
-      </w:r>
-      <w:r>
-        <w:rPr>
-          <w:rFonts w:ascii="Times New Roman" w:hAnsi="Times New Roman"/>
-          <w:b/>
-          <w:i w:val="0"/>
-          <w:sz w:val="22"/>
+          <w:sz w:val="24"/>
+        </w:rPr>
+      </w:r>
+      <w:r>
+        <w:rPr>
+          <w:rFonts w:ascii="Times New Roman" w:hAnsi="Times New Roman"/>
+          <w:b/>
+          <w:i w:val="0"/>
+          <w:sz w:val="24"/>
         </w:rPr>
         <w:t>`order_items` Table:</w:t>
       </w:r>
@@ -2131,7 +2128,7 @@
           <w:rFonts w:ascii="Times New Roman" w:hAnsi="Times New Roman"/>
           <w:b w:val="0"/>
           <w:i w:val="0"/>
-          <w:sz w:val="22"/>
+          <w:sz w:val="24"/>
         </w:rPr>
         <w:t xml:space="preserve"> Represents the specific line items of an order, capturing the exact price and quantity at the time of purchase to protect historical transaction logs.</w:t>
       </w:r>
@@ -2147,7 +2144,7 @@
           <w:rFonts w:ascii="Times New Roman" w:hAnsi="Times New Roman"/>
           <w:b/>
           <w:i w:val="0"/>
-          <w:sz w:val="22"/>
+          <w:sz w:val="24"/>
         </w:rPr>
         <w:t xml:space="preserve">7.  </w:t>
       </w:r>
@@ -2156,15 +2153,15 @@
           <w:rFonts w:ascii="Times New Roman" w:hAnsi="Times New Roman"/>
           <w:b w:val="0"/>
           <w:i w:val="0"/>
-          <w:sz w:val="22"/>
-        </w:rPr>
-      </w:r>
-      <w:r>
-        <w:rPr>
-          <w:rFonts w:ascii="Times New Roman" w:hAnsi="Times New Roman"/>
-          <w:b/>
-          <w:i w:val="0"/>
-          <w:sz w:val="22"/>
+          <w:sz w:val="24"/>
+        </w:rPr>
+      </w:r>
+      <w:r>
+        <w:rPr>
+          <w:rFonts w:ascii="Times New Roman" w:hAnsi="Times New Roman"/>
+          <w:b/>
+          <w:i w:val="0"/>
+          <w:sz w:val="24"/>
         </w:rPr>
         <w:t>`settings` Table:</w:t>
       </w:r>
@@ -2173,7 +2170,7 @@
           <w:rFonts w:ascii="Times New Roman" w:hAnsi="Times New Roman"/>
           <w:b w:val="0"/>
           <w:i w:val="0"/>
-          <w:sz w:val="22"/>
+          <w:sz w:val="24"/>
         </w:rPr>
         <w:t xml:space="preserve"> Key-value registry to govern operational states (e.g., store name, payment rules, maintenance mode status).</w:t>
       </w:r>
@@ -2190,7 +2187,7 @@
           <w:rFonts w:ascii="Times New Roman" w:hAnsi="Times New Roman"/>
           <w:b w:val="0"/>
           <w:i w:val="0"/>
-          <w:sz w:val="22"/>
+          <w:sz w:val="24"/>
         </w:rPr>
         <w:t>---</w:t>
       </w:r>
@@ -2209,7 +2206,7 @@
           <w:color w:val="000000"/>
           <w:sz w:val="26"/>
         </w:rPr>
-        <w:t>3. System Functionality &amp; Design (40% Weight)</w:t>
+        <w:t>3. System Functionality &amp; Design</w:t>
       </w:r>
     </w:p>
     <w:p>
@@ -2224,7 +2221,7 @@
           <w:rFonts w:ascii="Times New Roman" w:hAnsi="Times New Roman"/>
           <w:b w:val="0"/>
           <w:i w:val="0"/>
-          <w:sz w:val="22"/>
+          <w:sz w:val="24"/>
         </w:rPr>
         <w:t>This section details the primary software components, modules, and user interfaces designed to support business processes.</w:t>
       </w:r>
@@ -2258,7 +2255,7 @@
           <w:rFonts w:ascii="Times New Roman" w:hAnsi="Times New Roman"/>
           <w:b w:val="0"/>
           <w:i w:val="0"/>
-          <w:sz w:val="22"/>
+          <w:sz w:val="24"/>
         </w:rPr>
         <w:t>The storefront provides a consumer-facing, mobile-responsive portal that simplifies the purchasing process.</w:t>
       </w:r>
@@ -2291,7 +2288,7 @@
           <w:rFonts w:ascii="Times New Roman" w:hAnsi="Times New Roman"/>
           <w:b w:val="0"/>
           <w:i w:val="0"/>
-          <w:sz w:val="22"/>
+          <w:sz w:val="24"/>
         </w:rPr>
         <w:t xml:space="preserve">•  </w:t>
       </w:r>
@@ -2300,15 +2297,15 @@
           <w:rFonts w:ascii="Times New Roman" w:hAnsi="Times New Roman"/>
           <w:b w:val="0"/>
           <w:i w:val="0"/>
-          <w:sz w:val="22"/>
-        </w:rPr>
-      </w:r>
-      <w:r>
-        <w:rPr>
-          <w:rFonts w:ascii="Times New Roman" w:hAnsi="Times New Roman"/>
-          <w:b/>
-          <w:i w:val="0"/>
-          <w:sz w:val="22"/>
+          <w:sz w:val="24"/>
+        </w:rPr>
+      </w:r>
+      <w:r>
+        <w:rPr>
+          <w:rFonts w:ascii="Times New Roman" w:hAnsi="Times New Roman"/>
+          <w:b/>
+          <w:i w:val="0"/>
+          <w:sz w:val="24"/>
         </w:rPr>
         <w:t>Functionality:</w:t>
       </w:r>
@@ -2317,7 +2314,7 @@
           <w:rFonts w:ascii="Times New Roman" w:hAnsi="Times New Roman"/>
           <w:b w:val="0"/>
           <w:i w:val="0"/>
-          <w:sz w:val="22"/>
+          <w:sz w:val="24"/>
         </w:rPr>
         <w:t xml:space="preserve"> Features a categorized product grid with filtering capabilities. Clear search tools allow users to locate flower categories quickly.</w:t>
       </w:r>
@@ -2333,7 +2330,7 @@
           <w:rFonts w:ascii="Times New Roman" w:hAnsi="Times New Roman"/>
           <w:b w:val="0"/>
           <w:i w:val="0"/>
-          <w:sz w:val="22"/>
+          <w:sz w:val="24"/>
         </w:rPr>
         <w:t xml:space="preserve">•  </w:t>
       </w:r>
@@ -2342,15 +2339,15 @@
           <w:rFonts w:ascii="Times New Roman" w:hAnsi="Times New Roman"/>
           <w:b w:val="0"/>
           <w:i w:val="0"/>
-          <w:sz w:val="22"/>
-        </w:rPr>
-      </w:r>
-      <w:r>
-        <w:rPr>
-          <w:rFonts w:ascii="Times New Roman" w:hAnsi="Times New Roman"/>
-          <w:b/>
-          <w:i w:val="0"/>
-          <w:sz w:val="22"/>
+          <w:sz w:val="24"/>
+        </w:rPr>
+      </w:r>
+      <w:r>
+        <w:rPr>
+          <w:rFonts w:ascii="Times New Roman" w:hAnsi="Times New Roman"/>
+          <w:b/>
+          <w:i w:val="0"/>
+          <w:sz w:val="24"/>
         </w:rPr>
         <w:t>UX Design:</w:t>
       </w:r>
@@ -2359,7 +2356,7 @@
           <w:rFonts w:ascii="Times New Roman" w:hAnsi="Times New Roman"/>
           <w:b w:val="0"/>
           <w:i w:val="0"/>
-          <w:sz w:val="22"/>
+          <w:sz w:val="24"/>
         </w:rPr>
         <w:t xml:space="preserve"> Incorporates minimal styling with prominent product images, clear pricing tags, and add-to-cart call-to-actions.</w:t>
       </w:r>
@@ -2375,7 +2372,7 @@
           <w:rFonts w:ascii="Times New Roman" w:hAnsi="Times New Roman"/>
           <w:b w:val="0"/>
           <w:i w:val="0"/>
-          <w:sz w:val="22"/>
+          <w:sz w:val="24"/>
         </w:rPr>
         <w:t xml:space="preserve">•  </w:t>
       </w:r>
@@ -2384,15 +2381,15 @@
           <w:rFonts w:ascii="Times New Roman" w:hAnsi="Times New Roman"/>
           <w:b w:val="0"/>
           <w:i w:val="0"/>
-          <w:sz w:val="22"/>
-        </w:rPr>
-      </w:r>
-      <w:r>
-        <w:rPr>
-          <w:rFonts w:ascii="Times New Roman" w:hAnsi="Times New Roman"/>
-          <w:b/>
-          <w:i w:val="0"/>
-          <w:sz w:val="22"/>
+          <w:sz w:val="24"/>
+        </w:rPr>
+      </w:r>
+      <w:r>
+        <w:rPr>
+          <w:rFonts w:ascii="Times New Roman" w:hAnsi="Times New Roman"/>
+          <w:b/>
+          <w:i w:val="0"/>
+          <w:sz w:val="24"/>
         </w:rPr>
         <w:t>Screenshot Placeholder:</w:t>
       </w:r>
@@ -2401,7 +2398,7 @@
           <w:rFonts w:ascii="Times New Roman" w:hAnsi="Times New Roman"/>
           <w:b w:val="0"/>
           <w:i w:val="0"/>
-          <w:sz w:val="22"/>
+          <w:sz w:val="24"/>
         </w:rPr>
       </w:r>
     </w:p>
@@ -2451,7 +2448,7 @@
           <w:rFonts w:ascii="Times New Roman" w:hAnsi="Times New Roman"/>
           <w:b w:val="0"/>
           <w:i w:val="0"/>
-          <w:sz w:val="22"/>
+          <w:sz w:val="24"/>
         </w:rPr>
         <w:t xml:space="preserve">•  </w:t>
       </w:r>
@@ -2460,15 +2457,15 @@
           <w:rFonts w:ascii="Times New Roman" w:hAnsi="Times New Roman"/>
           <w:b w:val="0"/>
           <w:i w:val="0"/>
-          <w:sz w:val="22"/>
-        </w:rPr>
-      </w:r>
-      <w:r>
-        <w:rPr>
-          <w:rFonts w:ascii="Times New Roman" w:hAnsi="Times New Roman"/>
-          <w:b/>
-          <w:i w:val="0"/>
-          <w:sz w:val="22"/>
+          <w:sz w:val="24"/>
+        </w:rPr>
+      </w:r>
+      <w:r>
+        <w:rPr>
+          <w:rFonts w:ascii="Times New Roman" w:hAnsi="Times New Roman"/>
+          <w:b/>
+          <w:i w:val="0"/>
+          <w:sz w:val="24"/>
         </w:rPr>
         <w:t>Functionality:</w:t>
       </w:r>
@@ -2477,7 +2474,7 @@
           <w:rFonts w:ascii="Times New Roman" w:hAnsi="Times New Roman"/>
           <w:b w:val="0"/>
           <w:i w:val="0"/>
-          <w:sz w:val="22"/>
+          <w:sz w:val="24"/>
         </w:rPr>
         <w:t xml:space="preserve"> The storefront supports a persistent shopping cart alongside a </w:t>
       </w:r>
@@ -2486,7 +2483,7 @@
           <w:rFonts w:ascii="Times New Roman" w:hAnsi="Times New Roman"/>
           <w:b/>
           <w:i w:val="0"/>
-          <w:sz w:val="22"/>
+          <w:sz w:val="24"/>
         </w:rPr>
         <w:t>"Buy Now"</w:t>
       </w:r>
@@ -2495,7 +2492,7 @@
           <w:rFonts w:ascii="Times New Roman" w:hAnsi="Times New Roman"/>
           <w:b w:val="0"/>
           <w:i w:val="0"/>
-          <w:sz w:val="22"/>
+          <w:sz w:val="24"/>
         </w:rPr>
         <w:t xml:space="preserve"> button for direct checkout, skipping the cart process to expedite transactions.</w:t>
       </w:r>
@@ -2511,7 +2508,7 @@
           <w:rFonts w:ascii="Times New Roman" w:hAnsi="Times New Roman"/>
           <w:b w:val="0"/>
           <w:i w:val="0"/>
-          <w:sz w:val="22"/>
+          <w:sz w:val="24"/>
         </w:rPr>
         <w:t xml:space="preserve">•  </w:t>
       </w:r>
@@ -2520,15 +2517,15 @@
           <w:rFonts w:ascii="Times New Roman" w:hAnsi="Times New Roman"/>
           <w:b w:val="0"/>
           <w:i w:val="0"/>
-          <w:sz w:val="22"/>
-        </w:rPr>
-      </w:r>
-      <w:r>
-        <w:rPr>
-          <w:rFonts w:ascii="Times New Roman" w:hAnsi="Times New Roman"/>
-          <w:b/>
-          <w:i w:val="0"/>
-          <w:sz w:val="22"/>
+          <w:sz w:val="24"/>
+        </w:rPr>
+      </w:r>
+      <w:r>
+        <w:rPr>
+          <w:rFonts w:ascii="Times New Roman" w:hAnsi="Times New Roman"/>
+          <w:b/>
+          <w:i w:val="0"/>
+          <w:sz w:val="24"/>
         </w:rPr>
         <w:t>Add-on Selection:</w:t>
       </w:r>
@@ -2537,7 +2534,7 @@
           <w:rFonts w:ascii="Times New Roman" w:hAnsi="Times New Roman"/>
           <w:b w:val="0"/>
           <w:i w:val="0"/>
-          <w:sz w:val="22"/>
+          <w:sz w:val="24"/>
         </w:rPr>
         <w:t xml:space="preserve"> Integrates dynamic add-ons (e.g., custom greeting card, premium wrapping) that update the order total in real-time.</w:t>
       </w:r>
@@ -2553,7 +2550,7 @@
           <w:rFonts w:ascii="Times New Roman" w:hAnsi="Times New Roman"/>
           <w:b w:val="0"/>
           <w:i w:val="0"/>
-          <w:sz w:val="22"/>
+          <w:sz w:val="24"/>
         </w:rPr>
         <w:t xml:space="preserve">•  </w:t>
       </w:r>
@@ -2562,15 +2559,15 @@
           <w:rFonts w:ascii="Times New Roman" w:hAnsi="Times New Roman"/>
           <w:b w:val="0"/>
           <w:i w:val="0"/>
-          <w:sz w:val="22"/>
-        </w:rPr>
-      </w:r>
-      <w:r>
-        <w:rPr>
-          <w:rFonts w:ascii="Times New Roman" w:hAnsi="Times New Roman"/>
-          <w:b/>
-          <w:i w:val="0"/>
-          <w:sz w:val="22"/>
+          <w:sz w:val="24"/>
+        </w:rPr>
+      </w:r>
+      <w:r>
+        <w:rPr>
+          <w:rFonts w:ascii="Times New Roman" w:hAnsi="Times New Roman"/>
+          <w:b/>
+          <w:i w:val="0"/>
+          <w:sz w:val="24"/>
         </w:rPr>
         <w:t>Payment Support:</w:t>
       </w:r>
@@ -2579,7 +2576,7 @@
           <w:rFonts w:ascii="Times New Roman" w:hAnsi="Times New Roman"/>
           <w:b w:val="0"/>
           <w:i w:val="0"/>
-          <w:sz w:val="22"/>
+          <w:sz w:val="24"/>
         </w:rPr>
         <w:t xml:space="preserve"> Supports Cash on Delivery (COD) and GCash (with dynamic payment references).</w:t>
       </w:r>
@@ -2595,7 +2592,7 @@
           <w:rFonts w:ascii="Times New Roman" w:hAnsi="Times New Roman"/>
           <w:b w:val="0"/>
           <w:i w:val="0"/>
-          <w:sz w:val="22"/>
+          <w:sz w:val="24"/>
         </w:rPr>
         <w:t xml:space="preserve">•  </w:t>
       </w:r>
@@ -2604,15 +2601,15 @@
           <w:rFonts w:ascii="Times New Roman" w:hAnsi="Times New Roman"/>
           <w:b w:val="0"/>
           <w:i w:val="0"/>
-          <w:sz w:val="22"/>
-        </w:rPr>
-      </w:r>
-      <w:r>
-        <w:rPr>
-          <w:rFonts w:ascii="Times New Roman" w:hAnsi="Times New Roman"/>
-          <w:b/>
-          <w:i w:val="0"/>
-          <w:sz w:val="22"/>
+          <w:sz w:val="24"/>
+        </w:rPr>
+      </w:r>
+      <w:r>
+        <w:rPr>
+          <w:rFonts w:ascii="Times New Roman" w:hAnsi="Times New Roman"/>
+          <w:b/>
+          <w:i w:val="0"/>
+          <w:sz w:val="24"/>
         </w:rPr>
         <w:t>Screenshot Placeholder:</w:t>
       </w:r>
@@ -2621,7 +2618,7 @@
           <w:rFonts w:ascii="Times New Roman" w:hAnsi="Times New Roman"/>
           <w:b w:val="0"/>
           <w:i w:val="0"/>
-          <w:sz w:val="22"/>
+          <w:sz w:val="24"/>
         </w:rPr>
       </w:r>
     </w:p>
@@ -2671,7 +2668,7 @@
           <w:rFonts w:ascii="Times New Roman" w:hAnsi="Times New Roman"/>
           <w:b w:val="0"/>
           <w:i w:val="0"/>
-          <w:sz w:val="22"/>
+          <w:sz w:val="24"/>
         </w:rPr>
         <w:t xml:space="preserve">•  </w:t>
       </w:r>
@@ -2680,15 +2677,15 @@
           <w:rFonts w:ascii="Times New Roman" w:hAnsi="Times New Roman"/>
           <w:b w:val="0"/>
           <w:i w:val="0"/>
-          <w:sz w:val="22"/>
-        </w:rPr>
-      </w:r>
-      <w:r>
-        <w:rPr>
-          <w:rFonts w:ascii="Times New Roman" w:hAnsi="Times New Roman"/>
-          <w:b/>
-          <w:i w:val="0"/>
-          <w:sz w:val="22"/>
+          <w:sz w:val="24"/>
+        </w:rPr>
+      </w:r>
+      <w:r>
+        <w:rPr>
+          <w:rFonts w:ascii="Times New Roman" w:hAnsi="Times New Roman"/>
+          <w:b/>
+          <w:i w:val="0"/>
+          <w:sz w:val="24"/>
         </w:rPr>
         <w:t>Functionality:</w:t>
       </w:r>
@@ -2697,7 +2694,7 @@
           <w:rFonts w:ascii="Times New Roman" w:hAnsi="Times New Roman"/>
           <w:b w:val="0"/>
           <w:i w:val="0"/>
-          <w:sz w:val="22"/>
+          <w:sz w:val="24"/>
         </w:rPr>
         <w:t xml:space="preserve"> Upon order submission, the customer receives a unique order number. They can enter this number on the tracking page to view a progress timeline.</w:t>
       </w:r>
@@ -2713,7 +2710,7 @@
           <w:rFonts w:ascii="Times New Roman" w:hAnsi="Times New Roman"/>
           <w:b w:val="0"/>
           <w:i w:val="0"/>
-          <w:sz w:val="22"/>
+          <w:sz w:val="24"/>
         </w:rPr>
         <w:t xml:space="preserve">•  </w:t>
       </w:r>
@@ -2722,15 +2719,15 @@
           <w:rFonts w:ascii="Times New Roman" w:hAnsi="Times New Roman"/>
           <w:b w:val="0"/>
           <w:i w:val="0"/>
-          <w:sz w:val="22"/>
-        </w:rPr>
-      </w:r>
-      <w:r>
-        <w:rPr>
-          <w:rFonts w:ascii="Times New Roman" w:hAnsi="Times New Roman"/>
-          <w:b/>
-          <w:i w:val="0"/>
-          <w:sz w:val="22"/>
+          <w:sz w:val="24"/>
+        </w:rPr>
+      </w:r>
+      <w:r>
+        <w:rPr>
+          <w:rFonts w:ascii="Times New Roman" w:hAnsi="Times New Roman"/>
+          <w:b/>
+          <w:i w:val="0"/>
+          <w:sz w:val="24"/>
         </w:rPr>
         <w:t>Tracking States:</w:t>
       </w:r>
@@ -2739,7 +2736,7 @@
           <w:rFonts w:ascii="Times New Roman" w:hAnsi="Times New Roman"/>
           <w:b w:val="0"/>
           <w:i w:val="0"/>
-          <w:sz w:val="22"/>
+          <w:sz w:val="24"/>
         </w:rPr>
         <w:t xml:space="preserve"> Renders four distinct phases: `Pending` → `Processing` → `Shipped` → `Delivered`.</w:t>
       </w:r>
@@ -2755,7 +2752,7 @@
           <w:rFonts w:ascii="Times New Roman" w:hAnsi="Times New Roman"/>
           <w:b w:val="0"/>
           <w:i w:val="0"/>
-          <w:sz w:val="22"/>
+          <w:sz w:val="24"/>
         </w:rPr>
         <w:t xml:space="preserve">•  </w:t>
       </w:r>
@@ -2764,15 +2761,15 @@
           <w:rFonts w:ascii="Times New Roman" w:hAnsi="Times New Roman"/>
           <w:b w:val="0"/>
           <w:i w:val="0"/>
-          <w:sz w:val="22"/>
-        </w:rPr>
-      </w:r>
-      <w:r>
-        <w:rPr>
-          <w:rFonts w:ascii="Times New Roman" w:hAnsi="Times New Roman"/>
-          <w:b/>
-          <w:i w:val="0"/>
-          <w:sz w:val="22"/>
+          <w:sz w:val="24"/>
+        </w:rPr>
+      </w:r>
+      <w:r>
+        <w:rPr>
+          <w:rFonts w:ascii="Times New Roman" w:hAnsi="Times New Roman"/>
+          <w:b/>
+          <w:i w:val="0"/>
+          <w:sz w:val="24"/>
         </w:rPr>
         <w:t>Screenshot Placeholder:</w:t>
       </w:r>
@@ -2781,7 +2778,7 @@
           <w:rFonts w:ascii="Times New Roman" w:hAnsi="Times New Roman"/>
           <w:b w:val="0"/>
           <w:i w:val="0"/>
-          <w:sz w:val="22"/>
+          <w:sz w:val="24"/>
         </w:rPr>
       </w:r>
     </w:p>
@@ -2815,7 +2812,7 @@
           <w:rFonts w:ascii="Times New Roman" w:hAnsi="Times New Roman"/>
           <w:b w:val="0"/>
           <w:i w:val="0"/>
-          <w:sz w:val="22"/>
+          <w:sz w:val="24"/>
         </w:rPr>
         <w:t>---</w:t>
       </w:r>
@@ -2849,7 +2846,7 @@
           <w:rFonts w:ascii="Times New Roman" w:hAnsi="Times New Roman"/>
           <w:b w:val="0"/>
           <w:i w:val="0"/>
-          <w:sz w:val="22"/>
+          <w:sz w:val="24"/>
         </w:rPr>
         <w:t>The administrative portal serves as the business's central command center, offering tools to manage operations and monitor performance.</w:t>
       </w:r>
@@ -2882,7 +2879,7 @@
           <w:rFonts w:ascii="Times New Roman" w:hAnsi="Times New Roman"/>
           <w:b w:val="0"/>
           <w:i w:val="0"/>
-          <w:sz w:val="22"/>
+          <w:sz w:val="24"/>
         </w:rPr>
         <w:t xml:space="preserve">•  </w:t>
       </w:r>
@@ -2891,15 +2888,15 @@
           <w:rFonts w:ascii="Times New Roman" w:hAnsi="Times New Roman"/>
           <w:b w:val="0"/>
           <w:i w:val="0"/>
-          <w:sz w:val="22"/>
-        </w:rPr>
-      </w:r>
-      <w:r>
-        <w:rPr>
-          <w:rFonts w:ascii="Times New Roman" w:hAnsi="Times New Roman"/>
-          <w:b/>
-          <w:i w:val="0"/>
-          <w:sz w:val="22"/>
+          <w:sz w:val="24"/>
+        </w:rPr>
+      </w:r>
+      <w:r>
+        <w:rPr>
+          <w:rFonts w:ascii="Times New Roman" w:hAnsi="Times New Roman"/>
+          <w:b/>
+          <w:i w:val="0"/>
+          <w:sz w:val="24"/>
         </w:rPr>
         <w:t>Functionality:</w:t>
       </w:r>
@@ -2908,7 +2905,7 @@
           <w:rFonts w:ascii="Times New Roman" w:hAnsi="Times New Roman"/>
           <w:b w:val="0"/>
           <w:i w:val="0"/>
-          <w:sz w:val="22"/>
+          <w:sz w:val="24"/>
         </w:rPr>
         <w:t xml:space="preserve"> Displays primary key performance indicators (KPIs) immediately upon admin login.</w:t>
       </w:r>
@@ -2924,7 +2921,7 @@
           <w:rFonts w:ascii="Times New Roman" w:hAnsi="Times New Roman"/>
           <w:b w:val="0"/>
           <w:i w:val="0"/>
-          <w:sz w:val="22"/>
+          <w:sz w:val="24"/>
         </w:rPr>
         <w:t xml:space="preserve">•  </w:t>
       </w:r>
@@ -2933,15 +2930,15 @@
           <w:rFonts w:ascii="Times New Roman" w:hAnsi="Times New Roman"/>
           <w:b w:val="0"/>
           <w:i w:val="0"/>
-          <w:sz w:val="22"/>
-        </w:rPr>
-      </w:r>
-      <w:r>
-        <w:rPr>
-          <w:rFonts w:ascii="Times New Roman" w:hAnsi="Times New Roman"/>
-          <w:b/>
-          <w:i w:val="0"/>
-          <w:sz w:val="22"/>
+          <w:sz w:val="24"/>
+        </w:rPr>
+      </w:r>
+      <w:r>
+        <w:rPr>
+          <w:rFonts w:ascii="Times New Roman" w:hAnsi="Times New Roman"/>
+          <w:b/>
+          <w:i w:val="0"/>
+          <w:sz w:val="24"/>
         </w:rPr>
         <w:t>Tracked Metrics:</w:t>
       </w:r>
@@ -2950,7 +2947,7 @@
           <w:rFonts w:ascii="Times New Roman" w:hAnsi="Times New Roman"/>
           <w:b w:val="0"/>
           <w:i w:val="0"/>
-          <w:sz w:val="22"/>
+          <w:sz w:val="24"/>
         </w:rPr>
         <w:t xml:space="preserve"> Total Revenue, Total Orders, Pending Orders, Low Stock Alerts, and Add-on Sales.</w:t>
       </w:r>
@@ -2966,7 +2963,7 @@
           <w:rFonts w:ascii="Times New Roman" w:hAnsi="Times New Roman"/>
           <w:b w:val="0"/>
           <w:i w:val="0"/>
-          <w:sz w:val="22"/>
+          <w:sz w:val="24"/>
         </w:rPr>
         <w:t xml:space="preserve">•  </w:t>
       </w:r>
@@ -2975,15 +2972,15 @@
           <w:rFonts w:ascii="Times New Roman" w:hAnsi="Times New Roman"/>
           <w:b w:val="0"/>
           <w:i w:val="0"/>
-          <w:sz w:val="22"/>
-        </w:rPr>
-      </w:r>
-      <w:r>
-        <w:rPr>
-          <w:rFonts w:ascii="Times New Roman" w:hAnsi="Times New Roman"/>
-          <w:b/>
-          <w:i w:val="0"/>
-          <w:sz w:val="22"/>
+          <w:sz w:val="24"/>
+        </w:rPr>
+      </w:r>
+      <w:r>
+        <w:rPr>
+          <w:rFonts w:ascii="Times New Roman" w:hAnsi="Times New Roman"/>
+          <w:b/>
+          <w:i w:val="0"/>
+          <w:sz w:val="24"/>
         </w:rPr>
         <w:t>Screenshot Placeholder:</w:t>
       </w:r>
@@ -2992,7 +2989,7 @@
           <w:rFonts w:ascii="Times New Roman" w:hAnsi="Times New Roman"/>
           <w:b w:val="0"/>
           <w:i w:val="0"/>
-          <w:sz w:val="22"/>
+          <w:sz w:val="24"/>
         </w:rPr>
       </w:r>
     </w:p>
@@ -3042,7 +3039,7 @@
           <w:rFonts w:ascii="Times New Roman" w:hAnsi="Times New Roman"/>
           <w:b w:val="0"/>
           <w:i w:val="0"/>
-          <w:sz w:val="22"/>
+          <w:sz w:val="24"/>
         </w:rPr>
         <w:t xml:space="preserve">•  </w:t>
       </w:r>
@@ -3051,15 +3048,15 @@
           <w:rFonts w:ascii="Times New Roman" w:hAnsi="Times New Roman"/>
           <w:b w:val="0"/>
           <w:i w:val="0"/>
-          <w:sz w:val="22"/>
-        </w:rPr>
-      </w:r>
-      <w:r>
-        <w:rPr>
-          <w:rFonts w:ascii="Times New Roman" w:hAnsi="Times New Roman"/>
-          <w:b/>
-          <w:i w:val="0"/>
-          <w:sz w:val="22"/>
+          <w:sz w:val="24"/>
+        </w:rPr>
+      </w:r>
+      <w:r>
+        <w:rPr>
+          <w:rFonts w:ascii="Times New Roman" w:hAnsi="Times New Roman"/>
+          <w:b/>
+          <w:i w:val="0"/>
+          <w:sz w:val="24"/>
         </w:rPr>
         <w:t>Functionality:</w:t>
       </w:r>
@@ -3068,7 +3065,7 @@
           <w:rFonts w:ascii="Times New Roman" w:hAnsi="Times New Roman"/>
           <w:b w:val="0"/>
           <w:i w:val="0"/>
-          <w:sz w:val="22"/>
+          <w:sz w:val="24"/>
         </w:rPr>
         <w:t xml:space="preserve"> Provides a central registry of all incoming orders. Administrators can filter orders by status, inspect transaction summaries, and transition orders through fulfillment stages.</w:t>
       </w:r>
@@ -3084,7 +3081,7 @@
           <w:rFonts w:ascii="Times New Roman" w:hAnsi="Times New Roman"/>
           <w:b w:val="0"/>
           <w:i w:val="0"/>
-          <w:sz w:val="22"/>
+          <w:sz w:val="24"/>
         </w:rPr>
         <w:t xml:space="preserve">•  </w:t>
       </w:r>
@@ -3093,15 +3090,15 @@
           <w:rFonts w:ascii="Times New Roman" w:hAnsi="Times New Roman"/>
           <w:b w:val="0"/>
           <w:i w:val="0"/>
-          <w:sz w:val="22"/>
-        </w:rPr>
-      </w:r>
-      <w:r>
-        <w:rPr>
-          <w:rFonts w:ascii="Times New Roman" w:hAnsi="Times New Roman"/>
-          <w:b/>
-          <w:i w:val="0"/>
-          <w:sz w:val="22"/>
+          <w:sz w:val="24"/>
+        </w:rPr>
+      </w:r>
+      <w:r>
+        <w:rPr>
+          <w:rFonts w:ascii="Times New Roman" w:hAnsi="Times New Roman"/>
+          <w:b/>
+          <w:i w:val="0"/>
+          <w:sz w:val="24"/>
         </w:rPr>
         <w:t>Order Status Updates:</w:t>
       </w:r>
@@ -3110,7 +3107,7 @@
           <w:rFonts w:ascii="Times New Roman" w:hAnsi="Times New Roman"/>
           <w:b w:val="0"/>
           <w:i w:val="0"/>
-          <w:sz w:val="22"/>
+          <w:sz w:val="24"/>
         </w:rPr>
         <w:t xml:space="preserve"> Changes are logged, updating the customer tracking view and triggering automated updates.</w:t>
       </w:r>
@@ -3126,7 +3123,7 @@
           <w:rFonts w:ascii="Times New Roman" w:hAnsi="Times New Roman"/>
           <w:b w:val="0"/>
           <w:i w:val="0"/>
-          <w:sz w:val="22"/>
+          <w:sz w:val="24"/>
         </w:rPr>
         <w:t xml:space="preserve">•  </w:t>
       </w:r>
@@ -3135,15 +3132,15 @@
           <w:rFonts w:ascii="Times New Roman" w:hAnsi="Times New Roman"/>
           <w:b w:val="0"/>
           <w:i w:val="0"/>
-          <w:sz w:val="22"/>
-        </w:rPr>
-      </w:r>
-      <w:r>
-        <w:rPr>
-          <w:rFonts w:ascii="Times New Roman" w:hAnsi="Times New Roman"/>
-          <w:b/>
-          <w:i w:val="0"/>
-          <w:sz w:val="22"/>
+          <w:sz w:val="24"/>
+        </w:rPr>
+      </w:r>
+      <w:r>
+        <w:rPr>
+          <w:rFonts w:ascii="Times New Roman" w:hAnsi="Times New Roman"/>
+          <w:b/>
+          <w:i w:val="0"/>
+          <w:sz w:val="24"/>
         </w:rPr>
         <w:t>Screenshot Placeholder:</w:t>
       </w:r>
@@ -3152,7 +3149,7 @@
           <w:rFonts w:ascii="Times New Roman" w:hAnsi="Times New Roman"/>
           <w:b w:val="0"/>
           <w:i w:val="0"/>
-          <w:sz w:val="22"/>
+          <w:sz w:val="24"/>
         </w:rPr>
       </w:r>
     </w:p>
@@ -3202,7 +3199,7 @@
           <w:rFonts w:ascii="Times New Roman" w:hAnsi="Times New Roman"/>
           <w:b w:val="0"/>
           <w:i w:val="0"/>
-          <w:sz w:val="22"/>
+          <w:sz w:val="24"/>
         </w:rPr>
         <w:t xml:space="preserve">•  </w:t>
       </w:r>
@@ -3211,15 +3208,15 @@
           <w:rFonts w:ascii="Times New Roman" w:hAnsi="Times New Roman"/>
           <w:b w:val="0"/>
           <w:i w:val="0"/>
-          <w:sz w:val="22"/>
-        </w:rPr>
-      </w:r>
-      <w:r>
-        <w:rPr>
-          <w:rFonts w:ascii="Times New Roman" w:hAnsi="Times New Roman"/>
-          <w:b/>
-          <w:i w:val="0"/>
-          <w:sz w:val="22"/>
+          <w:sz w:val="24"/>
+        </w:rPr>
+      </w:r>
+      <w:r>
+        <w:rPr>
+          <w:rFonts w:ascii="Times New Roman" w:hAnsi="Times New Roman"/>
+          <w:b/>
+          <w:i w:val="0"/>
+          <w:sz w:val="24"/>
         </w:rPr>
         <w:t>Functionality:</w:t>
       </w:r>
@@ -3228,7 +3225,7 @@
           <w:rFonts w:ascii="Times New Roman" w:hAnsi="Times New Roman"/>
           <w:b w:val="0"/>
           <w:i w:val="0"/>
-          <w:sz w:val="22"/>
+          <w:sz w:val="24"/>
         </w:rPr>
         <w:t xml:space="preserve"> The system replaces manual spreadsheets with three dedicated, auto-generated report modules:</w:t>
       </w:r>
@@ -3244,7 +3241,7 @@
           <w:rFonts w:ascii="Times New Roman" w:hAnsi="Times New Roman"/>
           <w:b w:val="0"/>
           <w:i w:val="0"/>
-          <w:sz w:val="22"/>
+          <w:sz w:val="24"/>
         </w:rPr>
         <w:t xml:space="preserve">•  </w:t>
       </w:r>
@@ -3253,15 +3250,15 @@
           <w:rFonts w:ascii="Times New Roman" w:hAnsi="Times New Roman"/>
           <w:b w:val="0"/>
           <w:i w:val="0"/>
-          <w:sz w:val="22"/>
-        </w:rPr>
-      </w:r>
-      <w:r>
-        <w:rPr>
-          <w:rFonts w:ascii="Times New Roman" w:hAnsi="Times New Roman"/>
-          <w:b/>
-          <w:i w:val="0"/>
-          <w:sz w:val="22"/>
+          <w:sz w:val="24"/>
+        </w:rPr>
+      </w:r>
+      <w:r>
+        <w:rPr>
+          <w:rFonts w:ascii="Times New Roman" w:hAnsi="Times New Roman"/>
+          <w:b/>
+          <w:i w:val="0"/>
+          <w:sz w:val="24"/>
         </w:rPr>
         <w:t>Sales Report:</w:t>
       </w:r>
@@ -3270,7 +3267,7 @@
           <w:rFonts w:ascii="Times New Roman" w:hAnsi="Times New Roman"/>
           <w:b w:val="0"/>
           <w:i w:val="0"/>
-          <w:sz w:val="22"/>
+          <w:sz w:val="24"/>
         </w:rPr>
         <w:t xml:space="preserve"> Tracks daily, monthly, and yearly revenue patterns, showing total orders and average order value (AOV).</w:t>
       </w:r>
@@ -3286,7 +3283,7 @@
           <w:rFonts w:ascii="Times New Roman" w:hAnsi="Times New Roman"/>
           <w:b w:val="0"/>
           <w:i w:val="0"/>
-          <w:sz w:val="22"/>
+          <w:sz w:val="24"/>
         </w:rPr>
         <w:t xml:space="preserve">•  </w:t>
       </w:r>
@@ -3295,15 +3292,15 @@
           <w:rFonts w:ascii="Times New Roman" w:hAnsi="Times New Roman"/>
           <w:b w:val="0"/>
           <w:i w:val="0"/>
-          <w:sz w:val="22"/>
-        </w:rPr>
-      </w:r>
-      <w:r>
-        <w:rPr>
-          <w:rFonts w:ascii="Times New Roman" w:hAnsi="Times New Roman"/>
-          <w:b/>
-          <w:i w:val="0"/>
-          <w:sz w:val="22"/>
+          <w:sz w:val="24"/>
+        </w:rPr>
+      </w:r>
+      <w:r>
+        <w:rPr>
+          <w:rFonts w:ascii="Times New Roman" w:hAnsi="Times New Roman"/>
+          <w:b/>
+          <w:i w:val="0"/>
+          <w:sz w:val="24"/>
         </w:rPr>
         <w:t>Inventory Report:</w:t>
       </w:r>
@@ -3312,7 +3309,7 @@
           <w:rFonts w:ascii="Times New Roman" w:hAnsi="Times New Roman"/>
           <w:b w:val="0"/>
           <w:i w:val="0"/>
-          <w:sz w:val="22"/>
+          <w:sz w:val="24"/>
         </w:rPr>
         <w:t xml:space="preserve"> Displays current stock levels, low-stock warnings, and the total financial asset value of items in the warehouse.</w:t>
       </w:r>
@@ -3328,7 +3325,7 @@
           <w:rFonts w:ascii="Times New Roman" w:hAnsi="Times New Roman"/>
           <w:b w:val="0"/>
           <w:i w:val="0"/>
-          <w:sz w:val="22"/>
+          <w:sz w:val="24"/>
         </w:rPr>
         <w:t xml:space="preserve">•  </w:t>
       </w:r>
@@ -3337,15 +3334,15 @@
           <w:rFonts w:ascii="Times New Roman" w:hAnsi="Times New Roman"/>
           <w:b w:val="0"/>
           <w:i w:val="0"/>
-          <w:sz w:val="22"/>
-        </w:rPr>
-      </w:r>
-      <w:r>
-        <w:rPr>
-          <w:rFonts w:ascii="Times New Roman" w:hAnsi="Times New Roman"/>
-          <w:b/>
-          <w:i w:val="0"/>
-          <w:sz w:val="22"/>
+          <w:sz w:val="24"/>
+        </w:rPr>
+      </w:r>
+      <w:r>
+        <w:rPr>
+          <w:rFonts w:ascii="Times New Roman" w:hAnsi="Times New Roman"/>
+          <w:b/>
+          <w:i w:val="0"/>
+          <w:sz w:val="24"/>
         </w:rPr>
         <w:t>Customer Report (CRM):</w:t>
       </w:r>
@@ -3354,7 +3351,7 @@
           <w:rFonts w:ascii="Times New Roman" w:hAnsi="Times New Roman"/>
           <w:b w:val="0"/>
           <w:i w:val="0"/>
-          <w:sz w:val="22"/>
+          <w:sz w:val="24"/>
         </w:rPr>
         <w:t xml:space="preserve"> Identifies repeat buyers, listing purchase frequency and lifetime value (LTV) to support marketing campaigns.</w:t>
       </w:r>
@@ -3370,7 +3367,7 @@
           <w:rFonts w:ascii="Times New Roman" w:hAnsi="Times New Roman"/>
           <w:b w:val="0"/>
           <w:i w:val="0"/>
-          <w:sz w:val="22"/>
+          <w:sz w:val="24"/>
         </w:rPr>
         <w:t xml:space="preserve">•  </w:t>
       </w:r>
@@ -3379,15 +3376,15 @@
           <w:rFonts w:ascii="Times New Roman" w:hAnsi="Times New Roman"/>
           <w:b w:val="0"/>
           <w:i w:val="0"/>
-          <w:sz w:val="22"/>
-        </w:rPr>
-      </w:r>
-      <w:r>
-        <w:rPr>
-          <w:rFonts w:ascii="Times New Roman" w:hAnsi="Times New Roman"/>
-          <w:b/>
-          <w:i w:val="0"/>
-          <w:sz w:val="22"/>
+          <w:sz w:val="24"/>
+        </w:rPr>
+      </w:r>
+      <w:r>
+        <w:rPr>
+          <w:rFonts w:ascii="Times New Roman" w:hAnsi="Times New Roman"/>
+          <w:b/>
+          <w:i w:val="0"/>
+          <w:sz w:val="24"/>
         </w:rPr>
         <w:t>Screenshot Placeholder:</w:t>
       </w:r>
@@ -3396,7 +3393,7 @@
           <w:rFonts w:ascii="Times New Roman" w:hAnsi="Times New Roman"/>
           <w:b w:val="0"/>
           <w:i w:val="0"/>
-          <w:sz w:val="22"/>
+          <w:sz w:val="24"/>
         </w:rPr>
       </w:r>
     </w:p>
@@ -3446,7 +3443,7 @@
           <w:rFonts w:ascii="Times New Roman" w:hAnsi="Times New Roman"/>
           <w:b w:val="0"/>
           <w:i w:val="0"/>
-          <w:sz w:val="22"/>
+          <w:sz w:val="24"/>
         </w:rPr>
         <w:t xml:space="preserve">•  </w:t>
       </w:r>
@@ -3455,15 +3452,15 @@
           <w:rFonts w:ascii="Times New Roman" w:hAnsi="Times New Roman"/>
           <w:b w:val="0"/>
           <w:i w:val="0"/>
-          <w:sz w:val="22"/>
-        </w:rPr>
-      </w:r>
-      <w:r>
-        <w:rPr>
-          <w:rFonts w:ascii="Times New Roman" w:hAnsi="Times New Roman"/>
-          <w:b/>
-          <w:i w:val="0"/>
-          <w:sz w:val="22"/>
+          <w:sz w:val="24"/>
+        </w:rPr>
+      </w:r>
+      <w:r>
+        <w:rPr>
+          <w:rFonts w:ascii="Times New Roman" w:hAnsi="Times New Roman"/>
+          <w:b/>
+          <w:i w:val="0"/>
+          <w:sz w:val="24"/>
         </w:rPr>
         <w:t>Functionality:</w:t>
       </w:r>
@@ -3472,7 +3469,7 @@
           <w:rFonts w:ascii="Times New Roman" w:hAnsi="Times New Roman"/>
           <w:b w:val="0"/>
           <w:i w:val="0"/>
-          <w:sz w:val="22"/>
+          <w:sz w:val="24"/>
         </w:rPr>
         <w:t xml:space="preserve"> Allows administrators to modify core operating rules, change payment options, update contact information, and upload shop logos.</w:t>
       </w:r>
@@ -3488,7 +3485,7 @@
           <w:rFonts w:ascii="Times New Roman" w:hAnsi="Times New Roman"/>
           <w:b w:val="0"/>
           <w:i w:val="0"/>
-          <w:sz w:val="22"/>
+          <w:sz w:val="24"/>
         </w:rPr>
         <w:t xml:space="preserve">•  </w:t>
       </w:r>
@@ -3497,15 +3494,15 @@
           <w:rFonts w:ascii="Times New Roman" w:hAnsi="Times New Roman"/>
           <w:b w:val="0"/>
           <w:i w:val="0"/>
-          <w:sz w:val="22"/>
-        </w:rPr>
-      </w:r>
-      <w:r>
-        <w:rPr>
-          <w:rFonts w:ascii="Times New Roman" w:hAnsi="Times New Roman"/>
-          <w:b/>
-          <w:i w:val="0"/>
-          <w:sz w:val="22"/>
+          <w:sz w:val="24"/>
+        </w:rPr>
+      </w:r>
+      <w:r>
+        <w:rPr>
+          <w:rFonts w:ascii="Times New Roman" w:hAnsi="Times New Roman"/>
+          <w:b/>
+          <w:i w:val="0"/>
+          <w:sz w:val="24"/>
         </w:rPr>
         <w:t>Maintenance Toggle:</w:t>
       </w:r>
@@ -3514,7 +3511,7 @@
           <w:rFonts w:ascii="Times New Roman" w:hAnsi="Times New Roman"/>
           <w:b w:val="0"/>
           <w:i w:val="0"/>
-          <w:sz w:val="22"/>
+          <w:sz w:val="24"/>
         </w:rPr>
         <w:t xml:space="preserve"> Includes a global switch to place the site under a "Maintenance Mode" page during inventory restocks or server updates, preventing incoming orders while preserving admin access.</w:t>
       </w:r>
@@ -3530,7 +3527,7 @@
           <w:rFonts w:ascii="Times New Roman" w:hAnsi="Times New Roman"/>
           <w:b w:val="0"/>
           <w:i w:val="0"/>
-          <w:sz w:val="22"/>
+          <w:sz w:val="24"/>
         </w:rPr>
         <w:t xml:space="preserve">•  </w:t>
       </w:r>
@@ -3539,15 +3536,15 @@
           <w:rFonts w:ascii="Times New Roman" w:hAnsi="Times New Roman"/>
           <w:b w:val="0"/>
           <w:i w:val="0"/>
-          <w:sz w:val="22"/>
-        </w:rPr>
-      </w:r>
-      <w:r>
-        <w:rPr>
-          <w:rFonts w:ascii="Times New Roman" w:hAnsi="Times New Roman"/>
-          <w:b/>
-          <w:i w:val="0"/>
-          <w:sz w:val="22"/>
+          <w:sz w:val="24"/>
+        </w:rPr>
+      </w:r>
+      <w:r>
+        <w:rPr>
+          <w:rFonts w:ascii="Times New Roman" w:hAnsi="Times New Roman"/>
+          <w:b/>
+          <w:i w:val="0"/>
+          <w:sz w:val="24"/>
         </w:rPr>
         <w:t>Screenshot Placeholder:</w:t>
       </w:r>
@@ -3556,7 +3553,7 @@
           <w:rFonts w:ascii="Times New Roman" w:hAnsi="Times New Roman"/>
           <w:b w:val="0"/>
           <w:i w:val="0"/>
-          <w:sz w:val="22"/>
+          <w:sz w:val="24"/>
         </w:rPr>
       </w:r>
     </w:p>
@@ -3590,7 +3587,7 @@
           <w:rFonts w:ascii="Times New Roman" w:hAnsi="Times New Roman"/>
           <w:b w:val="0"/>
           <w:i w:val="0"/>
-          <w:sz w:val="22"/>
+          <w:sz w:val="24"/>
         </w:rPr>
         <w:t>---</w:t>
       </w:r>
@@ -3623,7 +3620,7 @@
           <w:rFonts w:ascii="Times New Roman" w:hAnsi="Times New Roman"/>
           <w:b w:val="0"/>
           <w:i w:val="0"/>
-          <w:sz w:val="22"/>
+          <w:sz w:val="24"/>
         </w:rPr>
         <w:t xml:space="preserve">•  </w:t>
       </w:r>
@@ -3632,15 +3629,15 @@
           <w:rFonts w:ascii="Times New Roman" w:hAnsi="Times New Roman"/>
           <w:b w:val="0"/>
           <w:i w:val="0"/>
-          <w:sz w:val="22"/>
-        </w:rPr>
-      </w:r>
-      <w:r>
-        <w:rPr>
-          <w:rFonts w:ascii="Times New Roman" w:hAnsi="Times New Roman"/>
-          <w:b/>
-          <w:i w:val="0"/>
-          <w:sz w:val="22"/>
+          <w:sz w:val="24"/>
+        </w:rPr>
+      </w:r>
+      <w:r>
+        <w:rPr>
+          <w:rFonts w:ascii="Times New Roman" w:hAnsi="Times New Roman"/>
+          <w:b/>
+          <w:i w:val="0"/>
+          <w:sz w:val="24"/>
         </w:rPr>
         <w:t>Cognitive Load Reduction:</w:t>
       </w:r>
@@ -3649,7 +3646,7 @@
           <w:rFonts w:ascii="Times New Roman" w:hAnsi="Times New Roman"/>
           <w:b w:val="0"/>
           <w:i w:val="0"/>
-          <w:sz w:val="22"/>
+          <w:sz w:val="24"/>
         </w:rPr>
         <w:t xml:space="preserve"> Designed to keep layout components spaced and intuitive. Product cards, add-on checkboxes, and form inputs are clean, reducing user friction.</w:t>
       </w:r>
@@ -3665,7 +3662,7 @@
           <w:rFonts w:ascii="Times New Roman" w:hAnsi="Times New Roman"/>
           <w:b w:val="0"/>
           <w:i w:val="0"/>
-          <w:sz w:val="22"/>
+          <w:sz w:val="24"/>
         </w:rPr>
         <w:t xml:space="preserve">•  </w:t>
       </w:r>
@@ -3674,15 +3671,15 @@
           <w:rFonts w:ascii="Times New Roman" w:hAnsi="Times New Roman"/>
           <w:b w:val="0"/>
           <w:i w:val="0"/>
-          <w:sz w:val="22"/>
-        </w:rPr>
-      </w:r>
-      <w:r>
-        <w:rPr>
-          <w:rFonts w:ascii="Times New Roman" w:hAnsi="Times New Roman"/>
-          <w:b/>
-          <w:i w:val="0"/>
-          <w:sz w:val="22"/>
+          <w:sz w:val="24"/>
+        </w:rPr>
+      </w:r>
+      <w:r>
+        <w:rPr>
+          <w:rFonts w:ascii="Times New Roman" w:hAnsi="Times New Roman"/>
+          <w:b/>
+          <w:i w:val="0"/>
+          <w:sz w:val="24"/>
         </w:rPr>
         <w:t>HSL Color Harmony:</w:t>
       </w:r>
@@ -3691,7 +3688,7 @@
           <w:rFonts w:ascii="Times New Roman" w:hAnsi="Times New Roman"/>
           <w:b w:val="0"/>
           <w:i w:val="0"/>
-          <w:sz w:val="22"/>
+          <w:sz w:val="24"/>
         </w:rPr>
         <w:t xml:space="preserve"> Uses a soft, warm color palette matching the botanical business category (curated rose pinks, soft sage greens, and neutral backgrounds), avoiding harsh default browser styles.</w:t>
       </w:r>
@@ -3707,7 +3704,7 @@
           <w:rFonts w:ascii="Times New Roman" w:hAnsi="Times New Roman"/>
           <w:b w:val="0"/>
           <w:i w:val="0"/>
-          <w:sz w:val="22"/>
+          <w:sz w:val="24"/>
         </w:rPr>
         <w:t xml:space="preserve">•  </w:t>
       </w:r>
@@ -3716,15 +3713,15 @@
           <w:rFonts w:ascii="Times New Roman" w:hAnsi="Times New Roman"/>
           <w:b w:val="0"/>
           <w:i w:val="0"/>
-          <w:sz w:val="22"/>
-        </w:rPr>
-      </w:r>
-      <w:r>
-        <w:rPr>
-          <w:rFonts w:ascii="Times New Roman" w:hAnsi="Times New Roman"/>
-          <w:b/>
-          <w:i w:val="0"/>
-          <w:sz w:val="22"/>
+          <w:sz w:val="24"/>
+        </w:rPr>
+      </w:r>
+      <w:r>
+        <w:rPr>
+          <w:rFonts w:ascii="Times New Roman" w:hAnsi="Times New Roman"/>
+          <w:b/>
+          <w:i w:val="0"/>
+          <w:sz w:val="24"/>
         </w:rPr>
         <w:t>Typography:</w:t>
       </w:r>
@@ -3733,7 +3730,7 @@
           <w:rFonts w:ascii="Times New Roman" w:hAnsi="Times New Roman"/>
           <w:b w:val="0"/>
           <w:i w:val="0"/>
-          <w:sz w:val="22"/>
+          <w:sz w:val="24"/>
         </w:rPr>
         <w:t xml:space="preserve"> Integrates modern, readable sans-serif typography (e.g., Outfit or Inter) loaded from Google Fonts.</w:t>
       </w:r>
@@ -3749,7 +3746,7 @@
           <w:rFonts w:ascii="Times New Roman" w:hAnsi="Times New Roman"/>
           <w:b w:val="0"/>
           <w:i w:val="0"/>
-          <w:sz w:val="22"/>
+          <w:sz w:val="24"/>
         </w:rPr>
         <w:t xml:space="preserve">•  </w:t>
       </w:r>
@@ -3758,15 +3755,15 @@
           <w:rFonts w:ascii="Times New Roman" w:hAnsi="Times New Roman"/>
           <w:b w:val="0"/>
           <w:i w:val="0"/>
-          <w:sz w:val="22"/>
-        </w:rPr>
-      </w:r>
-      <w:r>
-        <w:rPr>
-          <w:rFonts w:ascii="Times New Roman" w:hAnsi="Times New Roman"/>
-          <w:b/>
-          <w:i w:val="0"/>
-          <w:sz w:val="22"/>
+          <w:sz w:val="24"/>
+        </w:rPr>
+      </w:r>
+      <w:r>
+        <w:rPr>
+          <w:rFonts w:ascii="Times New Roman" w:hAnsi="Times New Roman"/>
+          <w:b/>
+          <w:i w:val="0"/>
+          <w:sz w:val="24"/>
         </w:rPr>
         <w:t>Responsive Grid Layouts:</w:t>
       </w:r>
@@ -3775,7 +3772,7 @@
           <w:rFonts w:ascii="Times New Roman" w:hAnsi="Times New Roman"/>
           <w:b w:val="0"/>
           <w:i w:val="0"/>
-          <w:sz w:val="22"/>
+          <w:sz w:val="24"/>
         </w:rPr>
         <w:t xml:space="preserve"> Employs CSS Flexbox and Grid layouts to ensure the storefront functions seamlessly on mobile devices, tablets, and desktop displays.</w:t>
       </w:r>
@@ -3792,7 +3789,7 @@
           <w:rFonts w:ascii="Times New Roman" w:hAnsi="Times New Roman"/>
           <w:b w:val="0"/>
           <w:i w:val="0"/>
-          <w:sz w:val="22"/>
+          <w:sz w:val="24"/>
         </w:rPr>
         <w:t>---</w:t>
       </w:r>
@@ -3811,7 +3808,7 @@
           <w:color w:val="000000"/>
           <w:sz w:val="26"/>
         </w:rPr>
-        <w:t>4. Problem-Solving, Security &amp; Non-Functional Innovations (20% Weight)</w:t>
+        <w:t>4. Problem-Solving, Security &amp; Non-Functional Innovations</w:t>
       </w:r>
     </w:p>
     <w:p>
@@ -3826,7 +3823,7 @@
           <w:rFonts w:ascii="Times New Roman" w:hAnsi="Times New Roman"/>
           <w:b w:val="0"/>
           <w:i w:val="0"/>
-          <w:sz w:val="22"/>
+          <w:sz w:val="24"/>
         </w:rPr>
         <w:t>PureBlooms implements several technical safeguards to address common failure points in transactional software.</w:t>
       </w:r>
@@ -3859,7 +3856,7 @@
           <w:rFonts w:ascii="Times New Roman" w:hAnsi="Times New Roman"/>
           <w:b w:val="0"/>
           <w:i w:val="0"/>
-          <w:sz w:val="22"/>
+          <w:sz w:val="24"/>
         </w:rPr>
         <w:t xml:space="preserve">•  </w:t>
       </w:r>
@@ -3868,15 +3865,15 @@
           <w:rFonts w:ascii="Times New Roman" w:hAnsi="Times New Roman"/>
           <w:b w:val="0"/>
           <w:i w:val="0"/>
-          <w:sz w:val="22"/>
-        </w:rPr>
-      </w:r>
-      <w:r>
-        <w:rPr>
-          <w:rFonts w:ascii="Times New Roman" w:hAnsi="Times New Roman"/>
-          <w:b/>
-          <w:i w:val="0"/>
-          <w:sz w:val="22"/>
+          <w:sz w:val="24"/>
+        </w:rPr>
+      </w:r>
+      <w:r>
+        <w:rPr>
+          <w:rFonts w:ascii="Times New Roman" w:hAnsi="Times New Roman"/>
+          <w:b/>
+          <w:i w:val="0"/>
+          <w:sz w:val="24"/>
         </w:rPr>
         <w:t>The Problem:</w:t>
       </w:r>
@@ -3885,7 +3882,7 @@
           <w:rFonts w:ascii="Times New Roman" w:hAnsi="Times New Roman"/>
           <w:b w:val="0"/>
           <w:i w:val="0"/>
-          <w:sz w:val="22"/>
+          <w:sz w:val="24"/>
         </w:rPr>
         <w:t xml:space="preserve"> In standard web setups, if a connection drops or a server errors while writing order details (after deducting stock), the system can drift into an inconsistent state (e.g., stock is reduced, but no order record is saved).</w:t>
       </w:r>
@@ -3901,7 +3898,7 @@
           <w:rFonts w:ascii="Times New Roman" w:hAnsi="Times New Roman"/>
           <w:b w:val="0"/>
           <w:i w:val="0"/>
-          <w:sz w:val="22"/>
+          <w:sz w:val="24"/>
         </w:rPr>
         <w:t xml:space="preserve">•  </w:t>
       </w:r>
@@ -3910,15 +3907,15 @@
           <w:rFonts w:ascii="Times New Roman" w:hAnsi="Times New Roman"/>
           <w:b w:val="0"/>
           <w:i w:val="0"/>
-          <w:sz w:val="22"/>
-        </w:rPr>
-      </w:r>
-      <w:r>
-        <w:rPr>
-          <w:rFonts w:ascii="Times New Roman" w:hAnsi="Times New Roman"/>
-          <w:b/>
-          <w:i w:val="0"/>
-          <w:sz w:val="22"/>
+          <w:sz w:val="24"/>
+        </w:rPr>
+      </w:r>
+      <w:r>
+        <w:rPr>
+          <w:rFonts w:ascii="Times New Roman" w:hAnsi="Times New Roman"/>
+          <w:b/>
+          <w:i w:val="0"/>
+          <w:sz w:val="24"/>
         </w:rPr>
         <w:t>The Solution:</w:t>
       </w:r>
@@ -3927,7 +3924,7 @@
           <w:rFonts w:ascii="Times New Roman" w:hAnsi="Times New Roman"/>
           <w:b w:val="0"/>
           <w:i w:val="0"/>
-          <w:sz w:val="22"/>
+          <w:sz w:val="24"/>
         </w:rPr>
         <w:t xml:space="preserve"> The checkout process is wrapped in database transactions (`DB::transaction`). If any database write fails (e.g., saving order metadata, saving order items, or updating product quantities), the system rolls back all writes. Either the entire transaction succeeds, or the database reverts to its original state.</w:t>
       </w:r>
@@ -3960,7 +3957,7 @@
           <w:rFonts w:ascii="Times New Roman" w:hAnsi="Times New Roman"/>
           <w:b w:val="0"/>
           <w:i w:val="0"/>
-          <w:sz w:val="22"/>
+          <w:sz w:val="24"/>
         </w:rPr>
         <w:t xml:space="preserve">•  </w:t>
       </w:r>
@@ -3969,15 +3966,15 @@
           <w:rFonts w:ascii="Times New Roman" w:hAnsi="Times New Roman"/>
           <w:b w:val="0"/>
           <w:i w:val="0"/>
-          <w:sz w:val="22"/>
-        </w:rPr>
-      </w:r>
-      <w:r>
-        <w:rPr>
-          <w:rFonts w:ascii="Times New Roman" w:hAnsi="Times New Roman"/>
-          <w:b/>
-          <w:i w:val="0"/>
-          <w:sz w:val="22"/>
+          <w:sz w:val="24"/>
+        </w:rPr>
+      </w:r>
+      <w:r>
+        <w:rPr>
+          <w:rFonts w:ascii="Times New Roman" w:hAnsi="Times New Roman"/>
+          <w:b/>
+          <w:i w:val="0"/>
+          <w:sz w:val="24"/>
         </w:rPr>
         <w:t>The Problem:</w:t>
       </w:r>
@@ -3986,7 +3983,7 @@
           <w:rFonts w:ascii="Times New Roman" w:hAnsi="Times New Roman"/>
           <w:b w:val="0"/>
           <w:i w:val="0"/>
-          <w:sz w:val="22"/>
+          <w:sz w:val="24"/>
         </w:rPr>
         <w:t xml:space="preserve"> E-commerce systems are sometimes vulnerable to "price hijacking," where a user modifies product prices using the browser's developer inspector tool prior to form submission.</w:t>
       </w:r>
@@ -4002,7 +3999,7 @@
           <w:rFonts w:ascii="Times New Roman" w:hAnsi="Times New Roman"/>
           <w:b w:val="0"/>
           <w:i w:val="0"/>
-          <w:sz w:val="22"/>
+          <w:sz w:val="24"/>
         </w:rPr>
         <w:t xml:space="preserve">•  </w:t>
       </w:r>
@@ -4011,15 +4008,15 @@
           <w:rFonts w:ascii="Times New Roman" w:hAnsi="Times New Roman"/>
           <w:b w:val="0"/>
           <w:i w:val="0"/>
-          <w:sz w:val="22"/>
-        </w:rPr>
-      </w:r>
-      <w:r>
-        <w:rPr>
-          <w:rFonts w:ascii="Times New Roman" w:hAnsi="Times New Roman"/>
-          <w:b/>
-          <w:i w:val="0"/>
-          <w:sz w:val="22"/>
+          <w:sz w:val="24"/>
+        </w:rPr>
+      </w:r>
+      <w:r>
+        <w:rPr>
+          <w:rFonts w:ascii="Times New Roman" w:hAnsi="Times New Roman"/>
+          <w:b/>
+          <w:i w:val="0"/>
+          <w:sz w:val="24"/>
         </w:rPr>
         <w:t>The Solution:</w:t>
       </w:r>
@@ -4028,7 +4025,7 @@
           <w:rFonts w:ascii="Times New Roman" w:hAnsi="Times New Roman"/>
           <w:b w:val="0"/>
           <w:i w:val="0"/>
-          <w:sz w:val="22"/>
+          <w:sz w:val="24"/>
         </w:rPr>
         <w:t xml:space="preserve"> PureBlooms ignores product and add-on price parameters sent in client requests. During checkout processing, the system takes the product ID from the client, retrieves the price from the secure database, and calculates the totals server-side.</w:t>
       </w:r>
@@ -4061,7 +4058,7 @@
           <w:rFonts w:ascii="Times New Roman" w:hAnsi="Times New Roman"/>
           <w:b w:val="0"/>
           <w:i w:val="0"/>
-          <w:sz w:val="22"/>
+          <w:sz w:val="24"/>
         </w:rPr>
         <w:t xml:space="preserve">•  </w:t>
       </w:r>
@@ -4070,15 +4067,15 @@
           <w:rFonts w:ascii="Times New Roman" w:hAnsi="Times New Roman"/>
           <w:b w:val="0"/>
           <w:i w:val="0"/>
-          <w:sz w:val="22"/>
-        </w:rPr>
-      </w:r>
-      <w:r>
-        <w:rPr>
-          <w:rFonts w:ascii="Times New Roman" w:hAnsi="Times New Roman"/>
-          <w:b/>
-          <w:i w:val="0"/>
-          <w:sz w:val="22"/>
+          <w:sz w:val="24"/>
+        </w:rPr>
+      </w:r>
+      <w:r>
+        <w:rPr>
+          <w:rFonts w:ascii="Times New Roman" w:hAnsi="Times New Roman"/>
+          <w:b/>
+          <w:i w:val="0"/>
+          <w:sz w:val="24"/>
         </w:rPr>
         <w:t>The Problem:</w:t>
       </w:r>
@@ -4087,7 +4084,7 @@
           <w:rFonts w:ascii="Times New Roman" w:hAnsi="Times New Roman"/>
           <w:b w:val="0"/>
           <w:i w:val="0"/>
-          <w:sz w:val="22"/>
+          <w:sz w:val="24"/>
         </w:rPr>
         <w:t xml:space="preserve"> Attackers may use automated scripts to guess passwords on administrative login screens.</w:t>
       </w:r>
@@ -4103,7 +4100,7 @@
           <w:rFonts w:ascii="Times New Roman" w:hAnsi="Times New Roman"/>
           <w:b w:val="0"/>
           <w:i w:val="0"/>
-          <w:sz w:val="22"/>
+          <w:sz w:val="24"/>
         </w:rPr>
         <w:t xml:space="preserve">•  </w:t>
       </w:r>
@@ -4112,15 +4109,15 @@
           <w:rFonts w:ascii="Times New Roman" w:hAnsi="Times New Roman"/>
           <w:b w:val="0"/>
           <w:i w:val="0"/>
-          <w:sz w:val="22"/>
-        </w:rPr>
-      </w:r>
-      <w:r>
-        <w:rPr>
-          <w:rFonts w:ascii="Times New Roman" w:hAnsi="Times New Roman"/>
-          <w:b/>
-          <w:i w:val="0"/>
-          <w:sz w:val="22"/>
+          <w:sz w:val="24"/>
+        </w:rPr>
+      </w:r>
+      <w:r>
+        <w:rPr>
+          <w:rFonts w:ascii="Times New Roman" w:hAnsi="Times New Roman"/>
+          <w:b/>
+          <w:i w:val="0"/>
+          <w:sz w:val="24"/>
         </w:rPr>
         <w:t>The Solution:</w:t>
       </w:r>
@@ -4129,7 +4126,7 @@
           <w:rFonts w:ascii="Times New Roman" w:hAnsi="Times New Roman"/>
           <w:b w:val="0"/>
           <w:i w:val="0"/>
-          <w:sz w:val="22"/>
+          <w:sz w:val="24"/>
         </w:rPr>
         <w:t xml:space="preserve"> Implements rate limiting and throttling via Laravel middleware (`throttle:3,60` on password updates and standard login forms). If a user fails authentication multiple times, the system blocks further attempts from their IP address for a set window.</w:t>
       </w:r>
@@ -4162,7 +4159,7 @@
           <w:rFonts w:ascii="Times New Roman" w:hAnsi="Times New Roman"/>
           <w:b w:val="0"/>
           <w:i w:val="0"/>
-          <w:sz w:val="22"/>
+          <w:sz w:val="24"/>
         </w:rPr>
         <w:t xml:space="preserve">•  </w:t>
       </w:r>
@@ -4171,15 +4168,15 @@
           <w:rFonts w:ascii="Times New Roman" w:hAnsi="Times New Roman"/>
           <w:b w:val="0"/>
           <w:i w:val="0"/>
-          <w:sz w:val="22"/>
-        </w:rPr>
-      </w:r>
-      <w:r>
-        <w:rPr>
-          <w:rFonts w:ascii="Times New Roman" w:hAnsi="Times New Roman"/>
-          <w:b/>
-          <w:i w:val="0"/>
-          <w:sz w:val="22"/>
+          <w:sz w:val="24"/>
+        </w:rPr>
+      </w:r>
+      <w:r>
+        <w:rPr>
+          <w:rFonts w:ascii="Times New Roman" w:hAnsi="Times New Roman"/>
+          <w:b/>
+          <w:i w:val="0"/>
+          <w:sz w:val="24"/>
         </w:rPr>
         <w:t>The Problem:</w:t>
       </w:r>
@@ -4188,7 +4185,7 @@
           <w:rFonts w:ascii="Times New Roman" w:hAnsi="Times New Roman"/>
           <w:b w:val="0"/>
           <w:i w:val="0"/>
-          <w:sz w:val="22"/>
+          <w:sz w:val="24"/>
         </w:rPr>
         <w:t xml:space="preserve"> Customers sometimes click the "Submit Order" button multiple times due to slow internet connections, generating duplicate transactions, incorrect inventory deductions, and double-billing.</w:t>
       </w:r>
@@ -4204,7 +4201,7 @@
           <w:rFonts w:ascii="Times New Roman" w:hAnsi="Times New Roman"/>
           <w:b w:val="0"/>
           <w:i w:val="0"/>
-          <w:sz w:val="22"/>
+          <w:sz w:val="24"/>
         </w:rPr>
         <w:t xml:space="preserve">•  </w:t>
       </w:r>
@@ -4213,15 +4210,15 @@
           <w:rFonts w:ascii="Times New Roman" w:hAnsi="Times New Roman"/>
           <w:b w:val="0"/>
           <w:i w:val="0"/>
-          <w:sz w:val="22"/>
-        </w:rPr>
-      </w:r>
-      <w:r>
-        <w:rPr>
-          <w:rFonts w:ascii="Times New Roman" w:hAnsi="Times New Roman"/>
-          <w:b/>
-          <w:i w:val="0"/>
-          <w:sz w:val="22"/>
+          <w:sz w:val="24"/>
+        </w:rPr>
+      </w:r>
+      <w:r>
+        <w:rPr>
+          <w:rFonts w:ascii="Times New Roman" w:hAnsi="Times New Roman"/>
+          <w:b/>
+          <w:i w:val="0"/>
+          <w:sz w:val="24"/>
         </w:rPr>
         <w:t>The Solution:</w:t>
       </w:r>
@@ -4230,7 +4227,7 @@
           <w:rFonts w:ascii="Times New Roman" w:hAnsi="Times New Roman"/>
           <w:b w:val="0"/>
           <w:i w:val="0"/>
-          <w:sz w:val="22"/>
+          <w:sz w:val="24"/>
         </w:rPr>
         <w:t xml:space="preserve"> The checkout form generates a unique cart session token. When the checkout request is received, the system verifies and flags this token. If a duplicate request with the same token is sent immediately after, the system filters out the subsequent request.</w:t>
       </w:r>
@@ -4263,7 +4260,7 @@
           <w:rFonts w:ascii="Times New Roman" w:hAnsi="Times New Roman"/>
           <w:b w:val="0"/>
           <w:i w:val="0"/>
-          <w:sz w:val="22"/>
+          <w:sz w:val="24"/>
         </w:rPr>
         <w:t xml:space="preserve">•  </w:t>
       </w:r>
@@ -4272,15 +4269,15 @@
           <w:rFonts w:ascii="Times New Roman" w:hAnsi="Times New Roman"/>
           <w:b w:val="0"/>
           <w:i w:val="0"/>
-          <w:sz w:val="22"/>
-        </w:rPr>
-      </w:r>
-      <w:r>
-        <w:rPr>
-          <w:rFonts w:ascii="Times New Roman" w:hAnsi="Times New Roman"/>
-          <w:b/>
-          <w:i w:val="0"/>
-          <w:sz w:val="22"/>
+          <w:sz w:val="24"/>
+        </w:rPr>
+      </w:r>
+      <w:r>
+        <w:rPr>
+          <w:rFonts w:ascii="Times New Roman" w:hAnsi="Times New Roman"/>
+          <w:b/>
+          <w:i w:val="0"/>
+          <w:sz w:val="24"/>
         </w:rPr>
         <w:t>The Problem:</w:t>
       </w:r>
@@ -4289,7 +4286,7 @@
           <w:rFonts w:ascii="Times New Roman" w:hAnsi="Times New Roman"/>
           <w:b w:val="0"/>
           <w:i w:val="0"/>
-          <w:sz w:val="22"/>
+          <w:sz w:val="24"/>
         </w:rPr>
         <w:t xml:space="preserve"> Querying settings from the database on every page load adds unnecessary database queries, slowing response times.</w:t>
       </w:r>
@@ -4305,7 +4302,7 @@
           <w:rFonts w:ascii="Times New Roman" w:hAnsi="Times New Roman"/>
           <w:b w:val="0"/>
           <w:i w:val="0"/>
-          <w:sz w:val="22"/>
+          <w:sz w:val="24"/>
         </w:rPr>
         <w:t xml:space="preserve">•  </w:t>
       </w:r>
@@ -4314,15 +4311,15 @@
           <w:rFonts w:ascii="Times New Roman" w:hAnsi="Times New Roman"/>
           <w:b w:val="0"/>
           <w:i w:val="0"/>
-          <w:sz w:val="22"/>
-        </w:rPr>
-      </w:r>
-      <w:r>
-        <w:rPr>
-          <w:rFonts w:ascii="Times New Roman" w:hAnsi="Times New Roman"/>
-          <w:b/>
-          <w:i w:val="0"/>
-          <w:sz w:val="22"/>
+          <w:sz w:val="24"/>
+        </w:rPr>
+      </w:r>
+      <w:r>
+        <w:rPr>
+          <w:rFonts w:ascii="Times New Roman" w:hAnsi="Times New Roman"/>
+          <w:b/>
+          <w:i w:val="0"/>
+          <w:sz w:val="24"/>
         </w:rPr>
         <w:t>The Solution:</w:t>
       </w:r>
@@ -4331,7 +4328,7 @@
           <w:rFonts w:ascii="Times New Roman" w:hAnsi="Times New Roman"/>
           <w:b w:val="0"/>
           <w:i w:val="0"/>
-          <w:sz w:val="22"/>
+          <w:sz w:val="24"/>
         </w:rPr>
         <w:t xml:space="preserve"> App settings are cached. A custom middleware (`App\Http\Middleware\CheckMaintenanceMode`) intercepts all public traffic and redirects visitors to `/maintenance` when maintenance mode is active, while allowing authenticated administrators to navigate the site.</w:t>
       </w:r>
@@ -4348,7 +4345,7 @@
           <w:rFonts w:ascii="Times New Roman" w:hAnsi="Times New Roman"/>
           <w:b w:val="0"/>
           <w:i w:val="0"/>
-          <w:sz w:val="22"/>
+          <w:sz w:val="24"/>
         </w:rPr>
         <w:t>---</w:t>
       </w:r>
@@ -4382,48 +4379,67 @@
           <w:rFonts w:ascii="Times New Roman" w:hAnsi="Times New Roman"/>
           <w:b w:val="0"/>
           <w:i w:val="0"/>
-          <w:sz w:val="22"/>
+          <w:sz w:val="24"/>
         </w:rPr>
         <w:t>PureBlooms is designed around the four primary functions of Organizational Management.</w:t>
       </w:r>
     </w:p>
     <w:p>
       <w:pPr>
-        <w:spacing w:before="120" w:after="120" w:line="240" w:lineRule="auto"/>
-        <w:ind w:left="720"/>
-        <w:jc w:val="left"/>
-      </w:pPr>
-      <w:r>
-        <w:rPr>
-          <w:rFonts w:ascii="Consolas" w:hAnsi="Consolas"/>
-          <w:b w:val="0"/>
-          <w:i w:val="0"/>
+        <w:keepNext/>
+        <w:spacing w:before="240" w:after="80"/>
+        <w:jc w:val="center"/>
+      </w:pPr>
+      <w:r>
+        <w:drawing>
+          <wp:inline xmlns:a="http://schemas.openxmlformats.org/drawingml/2006/main">
+            <wp:extent cx="4572000" cy="1030441"/>
+            <wp:docPr id="2" name="Picture 2"/>
+            <wp:cNvGraphicFramePr>
+              <a:graphicFrameLocks noChangeAspect="1"/>
+            </wp:cNvGraphicFramePr>
+            <a:graphic>
+              <a:graphicData uri="http://schemas.openxmlformats.org/drawingml/2006/picture">
+                <pic:pic>
+                  <pic:nvPicPr>
+                    <pic:cNvPr id="0" name="om_framework_diagram.png"/>
+                    <pic:cNvPicPr/>
+                  </pic:nvPicPr>
+                  <pic:blipFill>
+                    <a:blip r:embed="rId17"/>
+                    <a:stretch>
+                      <a:fillRect/>
+                    </a:stretch>
+                  </pic:blipFill>
+                  <pic:spPr>
+                    <a:xfrm>
+                      <a:off x="0" y="0"/>
+                      <a:ext cx="4572000" cy="1030441"/>
+                    </a:xfrm>
+                    <a:prstGeom prst="rect"/>
+                  </pic:spPr>
+                </pic:pic>
+              </a:graphicData>
+            </a:graphic>
+          </wp:inline>
+        </w:drawing>
+      </w:r>
+    </w:p>
+    <w:p>
+      <w:pPr>
+        <w:keepNext w:val="0"/>
+        <w:spacing w:before="40" w:after="240"/>
+        <w:jc w:val="center"/>
+      </w:pPr>
+      <w:r>
+        <w:rPr>
+          <w:rFonts w:ascii="Times New Roman" w:hAnsi="Times New Roman"/>
+          <w:b w:val="0"/>
+          <w:i/>
           <w:color w:val="505050"/>
-          <w:sz w:val="19"/>
-        </w:rPr>
-        <w:t>┌────────────────────────────────────────────────────────────────────────┐</w:t>
-        <w:br/>
-        <w:t>│                        PureBlooms OM Framework                         │</w:t>
-        <w:br/>
-        <w:t>└───────────────────────────────────┬────────────────────────────────────┘</w:t>
-        <w:br/>
-        <w:t xml:space="preserve">                                    │</w:t>
-        <w:br/>
-        <w:t xml:space="preserve">         ┌──────────────────────────┼──────────────────────────┐</w:t>
-        <w:br/>
-        <w:t xml:space="preserve">         ▼                          ▼                          ▼</w:t>
-        <w:br/>
-        <w:t xml:space="preserve">  ┌─────────────┐            ┌─────────────┐            ┌─────────────┐</w:t>
-        <w:br/>
-        <w:t xml:space="preserve">  │  Planning   │            │ Controlling │            │   Leading   │</w:t>
-        <w:br/>
-        <w:t xml:space="preserve">  └──────┬──────┘            └──────┬──────┘            └──────┬──────┘</w:t>
-        <w:br/>
-        <w:t xml:space="preserve">         │                          │                          │</w:t>
-        <w:br/>
-        <w:t xml:space="preserve">         ├─ Store Policies          ├─ Inventory Alerts        └─ KPI Reports</w:t>
-        <w:br/>
-        <w:t xml:space="preserve">         └─ Maintenance State       └─ Order Pipeline             (AOV, LTV)</w:t>
+          <w:sz w:val="20"/>
+        </w:rPr>
+        <w:t>Figure: OM Framework Diagram</w:t>
       </w:r>
     </w:p>
     <w:p>
@@ -4454,7 +4470,7 @@
           <w:rFonts w:ascii="Times New Roman" w:hAnsi="Times New Roman"/>
           <w:b w:val="0"/>
           <w:i w:val="0"/>
-          <w:sz w:val="22"/>
+          <w:sz w:val="24"/>
         </w:rPr>
         <w:t xml:space="preserve">•  </w:t>
       </w:r>
@@ -4463,15 +4479,15 @@
           <w:rFonts w:ascii="Times New Roman" w:hAnsi="Times New Roman"/>
           <w:b w:val="0"/>
           <w:i w:val="0"/>
-          <w:sz w:val="22"/>
-        </w:rPr>
-      </w:r>
-      <w:r>
-        <w:rPr>
-          <w:rFonts w:ascii="Times New Roman" w:hAnsi="Times New Roman"/>
-          <w:b/>
-          <w:i w:val="0"/>
-          <w:sz w:val="22"/>
+          <w:sz w:val="24"/>
+        </w:rPr>
+      </w:r>
+      <w:r>
+        <w:rPr>
+          <w:rFonts w:ascii="Times New Roman" w:hAnsi="Times New Roman"/>
+          <w:b/>
+          <w:i w:val="0"/>
+          <w:sz w:val="24"/>
         </w:rPr>
         <w:t>Definition:</w:t>
       </w:r>
@@ -4480,7 +4496,7 @@
           <w:rFonts w:ascii="Times New Roman" w:hAnsi="Times New Roman"/>
           <w:b w:val="0"/>
           <w:i w:val="0"/>
-          <w:sz w:val="22"/>
+          <w:sz w:val="24"/>
         </w:rPr>
         <w:t xml:space="preserve"> Defining organizational goals, formulating strategies, and setting policies to coordinate activities.</w:t>
       </w:r>
@@ -4496,7 +4512,7 @@
           <w:rFonts w:ascii="Times New Roman" w:hAnsi="Times New Roman"/>
           <w:b w:val="0"/>
           <w:i w:val="0"/>
-          <w:sz w:val="22"/>
+          <w:sz w:val="24"/>
         </w:rPr>
         <w:t xml:space="preserve">•  </w:t>
       </w:r>
@@ -4505,15 +4521,15 @@
           <w:rFonts w:ascii="Times New Roman" w:hAnsi="Times New Roman"/>
           <w:b w:val="0"/>
           <w:i w:val="0"/>
-          <w:sz w:val="22"/>
-        </w:rPr>
-      </w:r>
-      <w:r>
-        <w:rPr>
-          <w:rFonts w:ascii="Times New Roman" w:hAnsi="Times New Roman"/>
-          <w:b/>
-          <w:i w:val="0"/>
-          <w:sz w:val="22"/>
+          <w:sz w:val="24"/>
+        </w:rPr>
+      </w:r>
+      <w:r>
+        <w:rPr>
+          <w:rFonts w:ascii="Times New Roman" w:hAnsi="Times New Roman"/>
+          <w:b/>
+          <w:i w:val="0"/>
+          <w:sz w:val="24"/>
         </w:rPr>
         <w:t>System Mapping:</w:t>
       </w:r>
@@ -4522,7 +4538,7 @@
           <w:rFonts w:ascii="Times New Roman" w:hAnsi="Times New Roman"/>
           <w:b w:val="0"/>
           <w:i w:val="0"/>
-          <w:sz w:val="22"/>
+          <w:sz w:val="24"/>
         </w:rPr>
         <w:t xml:space="preserve"> Managed through the </w:t>
       </w:r>
@@ -4531,7 +4547,7 @@
           <w:rFonts w:ascii="Times New Roman" w:hAnsi="Times New Roman"/>
           <w:b/>
           <w:i w:val="0"/>
-          <w:sz w:val="22"/>
+          <w:sz w:val="24"/>
         </w:rPr>
         <w:t>Settings module</w:t>
       </w:r>
@@ -4540,7 +4556,7 @@
           <w:rFonts w:ascii="Times New Roman" w:hAnsi="Times New Roman"/>
           <w:b w:val="0"/>
           <w:i w:val="0"/>
-          <w:sz w:val="22"/>
+          <w:sz w:val="24"/>
         </w:rPr>
         <w:t>. Administrators can plan store parameters, activate or deactivate payment methods, and toggle Maintenance Mode. This lets management define active operational boundaries and handle transitions (e.g., closing the shop temporarily during holidays or supply chain delays).</w:t>
       </w:r>
@@ -4573,7 +4589,7 @@
           <w:rFonts w:ascii="Times New Roman" w:hAnsi="Times New Roman"/>
           <w:b w:val="0"/>
           <w:i w:val="0"/>
-          <w:sz w:val="22"/>
+          <w:sz w:val="24"/>
         </w:rPr>
         <w:t xml:space="preserve">•  </w:t>
       </w:r>
@@ -4582,15 +4598,15 @@
           <w:rFonts w:ascii="Times New Roman" w:hAnsi="Times New Roman"/>
           <w:b w:val="0"/>
           <w:i w:val="0"/>
-          <w:sz w:val="22"/>
-        </w:rPr>
-      </w:r>
-      <w:r>
-        <w:rPr>
-          <w:rFonts w:ascii="Times New Roman" w:hAnsi="Times New Roman"/>
-          <w:b/>
-          <w:i w:val="0"/>
-          <w:sz w:val="22"/>
+          <w:sz w:val="24"/>
+        </w:rPr>
+      </w:r>
+      <w:r>
+        <w:rPr>
+          <w:rFonts w:ascii="Times New Roman" w:hAnsi="Times New Roman"/>
+          <w:b/>
+          <w:i w:val="0"/>
+          <w:sz w:val="24"/>
         </w:rPr>
         <w:t>Definition:</w:t>
       </w:r>
@@ -4599,7 +4615,7 @@
           <w:rFonts w:ascii="Times New Roman" w:hAnsi="Times New Roman"/>
           <w:b w:val="0"/>
           <w:i w:val="0"/>
-          <w:sz w:val="22"/>
+          <w:sz w:val="24"/>
         </w:rPr>
         <w:t xml:space="preserve"> Designing administrative structures, assigning tasks, grouping activities, and allocating resources.</w:t>
       </w:r>
@@ -4615,7 +4631,7 @@
           <w:rFonts w:ascii="Times New Roman" w:hAnsi="Times New Roman"/>
           <w:b w:val="0"/>
           <w:i w:val="0"/>
-          <w:sz w:val="22"/>
+          <w:sz w:val="24"/>
         </w:rPr>
         <w:t xml:space="preserve">•  </w:t>
       </w:r>
@@ -4624,15 +4640,15 @@
           <w:rFonts w:ascii="Times New Roman" w:hAnsi="Times New Roman"/>
           <w:b w:val="0"/>
           <w:i w:val="0"/>
-          <w:sz w:val="22"/>
-        </w:rPr>
-      </w:r>
-      <w:r>
-        <w:rPr>
-          <w:rFonts w:ascii="Times New Roman" w:hAnsi="Times New Roman"/>
-          <w:b/>
-          <w:i w:val="0"/>
-          <w:sz w:val="22"/>
+          <w:sz w:val="24"/>
+        </w:rPr>
+      </w:r>
+      <w:r>
+        <w:rPr>
+          <w:rFonts w:ascii="Times New Roman" w:hAnsi="Times New Roman"/>
+          <w:b/>
+          <w:i w:val="0"/>
+          <w:sz w:val="24"/>
         </w:rPr>
         <w:t>System Mapping:</w:t>
       </w:r>
@@ -4641,7 +4657,7 @@
           <w:rFonts w:ascii="Times New Roman" w:hAnsi="Times New Roman"/>
           <w:b w:val="0"/>
           <w:i w:val="0"/>
-          <w:sz w:val="22"/>
+          <w:sz w:val="24"/>
         </w:rPr>
         <w:t xml:space="preserve"> Supported by </w:t>
       </w:r>
@@ -4650,7 +4666,7 @@
           <w:rFonts w:ascii="Times New Roman" w:hAnsi="Times New Roman"/>
           <w:b/>
           <w:i w:val="0"/>
-          <w:sz w:val="22"/>
+          <w:sz w:val="24"/>
         </w:rPr>
         <w:t>Role-Based Access Control (RBAC) middleware</w:t>
       </w:r>
@@ -4659,7 +4675,7 @@
           <w:rFonts w:ascii="Times New Roman" w:hAnsi="Times New Roman"/>
           <w:b w:val="0"/>
           <w:i w:val="0"/>
-          <w:sz w:val="22"/>
+          <w:sz w:val="24"/>
         </w:rPr>
         <w:t>. The system enforces two distinct roles: Customers and Admins. Only authenticated administrators have access to inventory management, reporting modules, and settings dashboards. This maps authorization boundaries to personnel roles.</w:t>
       </w:r>
@@ -4692,7 +4708,7 @@
           <w:rFonts w:ascii="Times New Roman" w:hAnsi="Times New Roman"/>
           <w:b w:val="0"/>
           <w:i w:val="0"/>
-          <w:sz w:val="22"/>
+          <w:sz w:val="24"/>
         </w:rPr>
         <w:t xml:space="preserve">•  </w:t>
       </w:r>
@@ -4701,15 +4717,15 @@
           <w:rFonts w:ascii="Times New Roman" w:hAnsi="Times New Roman"/>
           <w:b w:val="0"/>
           <w:i w:val="0"/>
-          <w:sz w:val="22"/>
-        </w:rPr>
-      </w:r>
-      <w:r>
-        <w:rPr>
-          <w:rFonts w:ascii="Times New Roman" w:hAnsi="Times New Roman"/>
-          <w:b/>
-          <w:i w:val="0"/>
-          <w:sz w:val="22"/>
+          <w:sz w:val="24"/>
+        </w:rPr>
+      </w:r>
+      <w:r>
+        <w:rPr>
+          <w:rFonts w:ascii="Times New Roman" w:hAnsi="Times New Roman"/>
+          <w:b/>
+          <w:i w:val="0"/>
+          <w:sz w:val="24"/>
         </w:rPr>
         <w:t>Definition:</w:t>
       </w:r>
@@ -4718,7 +4734,7 @@
           <w:rFonts w:ascii="Times New Roman" w:hAnsi="Times New Roman"/>
           <w:b w:val="0"/>
           <w:i w:val="0"/>
-          <w:sz w:val="22"/>
+          <w:sz w:val="24"/>
         </w:rPr>
         <w:t xml:space="preserve"> Directing, motivating, and influencing stakeholders to achieve organizational objectives using data-driven insights.</w:t>
       </w:r>
@@ -4734,7 +4750,7 @@
           <w:rFonts w:ascii="Times New Roman" w:hAnsi="Times New Roman"/>
           <w:b w:val="0"/>
           <w:i w:val="0"/>
-          <w:sz w:val="22"/>
+          <w:sz w:val="24"/>
         </w:rPr>
         <w:t xml:space="preserve">•  </w:t>
       </w:r>
@@ -4743,15 +4759,15 @@
           <w:rFonts w:ascii="Times New Roman" w:hAnsi="Times New Roman"/>
           <w:b w:val="0"/>
           <w:i w:val="0"/>
-          <w:sz w:val="22"/>
-        </w:rPr>
-      </w:r>
-      <w:r>
-        <w:rPr>
-          <w:rFonts w:ascii="Times New Roman" w:hAnsi="Times New Roman"/>
-          <w:b/>
-          <w:i w:val="0"/>
-          <w:sz w:val="22"/>
+          <w:sz w:val="24"/>
+        </w:rPr>
+      </w:r>
+      <w:r>
+        <w:rPr>
+          <w:rFonts w:ascii="Times New Roman" w:hAnsi="Times New Roman"/>
+          <w:b/>
+          <w:i w:val="0"/>
+          <w:sz w:val="24"/>
         </w:rPr>
         <w:t>System Mapping:</w:t>
       </w:r>
@@ -4760,7 +4776,7 @@
           <w:rFonts w:ascii="Times New Roman" w:hAnsi="Times New Roman"/>
           <w:b w:val="0"/>
           <w:i w:val="0"/>
-          <w:sz w:val="22"/>
+          <w:sz w:val="24"/>
         </w:rPr>
         <w:t xml:space="preserve"> Enabled through the </w:t>
       </w:r>
@@ -4769,7 +4785,7 @@
           <w:rFonts w:ascii="Times New Roman" w:hAnsi="Times New Roman"/>
           <w:b/>
           <w:i w:val="0"/>
-          <w:sz w:val="22"/>
+          <w:sz w:val="24"/>
         </w:rPr>
         <w:t>KPI Dashboard</w:t>
       </w:r>
@@ -4778,7 +4794,7 @@
           <w:rFonts w:ascii="Times New Roman" w:hAnsi="Times New Roman"/>
           <w:b w:val="0"/>
           <w:i w:val="0"/>
-          <w:sz w:val="22"/>
+          <w:sz w:val="24"/>
         </w:rPr>
         <w:t>. Managers access real-time metrics on sales performance, order counts, and customer buying patterns. These insights guide marketing campaigns, staffing allocations, and pricing adjustments.</w:t>
       </w:r>
@@ -4811,7 +4827,7 @@
           <w:rFonts w:ascii="Times New Roman" w:hAnsi="Times New Roman"/>
           <w:b w:val="0"/>
           <w:i w:val="0"/>
-          <w:sz w:val="22"/>
+          <w:sz w:val="24"/>
         </w:rPr>
         <w:t xml:space="preserve">•  </w:t>
       </w:r>
@@ -4820,15 +4836,15 @@
           <w:rFonts w:ascii="Times New Roman" w:hAnsi="Times New Roman"/>
           <w:b w:val="0"/>
           <w:i w:val="0"/>
-          <w:sz w:val="22"/>
-        </w:rPr>
-      </w:r>
-      <w:r>
-        <w:rPr>
-          <w:rFonts w:ascii="Times New Roman" w:hAnsi="Times New Roman"/>
-          <w:b/>
-          <w:i w:val="0"/>
-          <w:sz w:val="22"/>
+          <w:sz w:val="24"/>
+        </w:rPr>
+      </w:r>
+      <w:r>
+        <w:rPr>
+          <w:rFonts w:ascii="Times New Roman" w:hAnsi="Times New Roman"/>
+          <w:b/>
+          <w:i w:val="0"/>
+          <w:sz w:val="24"/>
         </w:rPr>
         <w:t>Definition:</w:t>
       </w:r>
@@ -4837,7 +4853,7 @@
           <w:rFonts w:ascii="Times New Roman" w:hAnsi="Times New Roman"/>
           <w:b w:val="0"/>
           <w:i w:val="0"/>
-          <w:sz w:val="22"/>
+          <w:sz w:val="24"/>
         </w:rPr>
         <w:t xml:space="preserve"> Monitoring performance, comparing it with organizational goals, and taking corrective actions.</w:t>
       </w:r>
@@ -4853,7 +4869,7 @@
           <w:rFonts w:ascii="Times New Roman" w:hAnsi="Times New Roman"/>
           <w:b w:val="0"/>
           <w:i w:val="0"/>
-          <w:sz w:val="22"/>
+          <w:sz w:val="24"/>
         </w:rPr>
         <w:t xml:space="preserve">•  </w:t>
       </w:r>
@@ -4862,15 +4878,15 @@
           <w:rFonts w:ascii="Times New Roman" w:hAnsi="Times New Roman"/>
           <w:b w:val="0"/>
           <w:i w:val="0"/>
-          <w:sz w:val="22"/>
-        </w:rPr>
-      </w:r>
-      <w:r>
-        <w:rPr>
-          <w:rFonts w:ascii="Times New Roman" w:hAnsi="Times New Roman"/>
-          <w:b/>
-          <w:i w:val="0"/>
-          <w:sz w:val="22"/>
+          <w:sz w:val="24"/>
+        </w:rPr>
+      </w:r>
+      <w:r>
+        <w:rPr>
+          <w:rFonts w:ascii="Times New Roman" w:hAnsi="Times New Roman"/>
+          <w:b/>
+          <w:i w:val="0"/>
+          <w:sz w:val="24"/>
         </w:rPr>
         <w:t>System Mapping:</w:t>
       </w:r>
@@ -4879,7 +4895,7 @@
           <w:rFonts w:ascii="Times New Roman" w:hAnsi="Times New Roman"/>
           <w:b w:val="0"/>
           <w:i w:val="0"/>
-          <w:sz w:val="22"/>
+          <w:sz w:val="24"/>
         </w:rPr>
         <w:t xml:space="preserve"> Supported by the following components:</w:t>
       </w:r>
@@ -4895,7 +4911,7 @@
           <w:rFonts w:ascii="Times New Roman" w:hAnsi="Times New Roman"/>
           <w:b w:val="0"/>
           <w:i w:val="0"/>
-          <w:sz w:val="22"/>
+          <w:sz w:val="24"/>
         </w:rPr>
         <w:t xml:space="preserve">•  </w:t>
       </w:r>
@@ -4904,15 +4920,15 @@
           <w:rFonts w:ascii="Times New Roman" w:hAnsi="Times New Roman"/>
           <w:b w:val="0"/>
           <w:i w:val="0"/>
-          <w:sz w:val="22"/>
-        </w:rPr>
-      </w:r>
-      <w:r>
-        <w:rPr>
-          <w:rFonts w:ascii="Times New Roman" w:hAnsi="Times New Roman"/>
-          <w:b/>
-          <w:i w:val="0"/>
-          <w:sz w:val="22"/>
+          <w:sz w:val="24"/>
+        </w:rPr>
+      </w:r>
+      <w:r>
+        <w:rPr>
+          <w:rFonts w:ascii="Times New Roman" w:hAnsi="Times New Roman"/>
+          <w:b/>
+          <w:i w:val="0"/>
+          <w:sz w:val="24"/>
         </w:rPr>
         <w:t>Low Stock Alerts:</w:t>
       </w:r>
@@ -4921,7 +4937,7 @@
           <w:rFonts w:ascii="Times New Roman" w:hAnsi="Times New Roman"/>
           <w:b w:val="0"/>
           <w:i w:val="0"/>
-          <w:sz w:val="22"/>
+          <w:sz w:val="24"/>
         </w:rPr>
         <w:t xml:space="preserve"> Automatically flags items falling below defined inventory thresholds, signaling replenishment needs.</w:t>
       </w:r>
@@ -4937,7 +4953,7 @@
           <w:rFonts w:ascii="Times New Roman" w:hAnsi="Times New Roman"/>
           <w:b w:val="0"/>
           <w:i w:val="0"/>
-          <w:sz w:val="22"/>
+          <w:sz w:val="24"/>
         </w:rPr>
         <w:t xml:space="preserve">•  </w:t>
       </w:r>
@@ -4946,15 +4962,15 @@
           <w:rFonts w:ascii="Times New Roman" w:hAnsi="Times New Roman"/>
           <w:b w:val="0"/>
           <w:i w:val="0"/>
-          <w:sz w:val="22"/>
-        </w:rPr>
-      </w:r>
-      <w:r>
-        <w:rPr>
-          <w:rFonts w:ascii="Times New Roman" w:hAnsi="Times New Roman"/>
-          <w:b/>
-          <w:i w:val="0"/>
-          <w:sz w:val="22"/>
+          <w:sz w:val="24"/>
+        </w:rPr>
+      </w:r>
+      <w:r>
+        <w:rPr>
+          <w:rFonts w:ascii="Times New Roman" w:hAnsi="Times New Roman"/>
+          <w:b/>
+          <w:i w:val="0"/>
+          <w:sz w:val="24"/>
         </w:rPr>
         <w:t>Order Pipeline:</w:t>
       </w:r>
@@ -4963,7 +4979,7 @@
           <w:rFonts w:ascii="Times New Roman" w:hAnsi="Times New Roman"/>
           <w:b w:val="0"/>
           <w:i w:val="0"/>
-          <w:sz w:val="22"/>
+          <w:sz w:val="24"/>
         </w:rPr>
         <w:t xml:space="preserve"> Tracks orders as they progress from `Pending` to `Delivered`, identifying delays.</w:t>
       </w:r>
@@ -4979,7 +4995,7 @@
           <w:rFonts w:ascii="Times New Roman" w:hAnsi="Times New Roman"/>
           <w:b w:val="0"/>
           <w:i w:val="0"/>
-          <w:sz w:val="22"/>
+          <w:sz w:val="24"/>
         </w:rPr>
         <w:t xml:space="preserve">•  </w:t>
       </w:r>
@@ -4988,15 +5004,15 @@
           <w:rFonts w:ascii="Times New Roman" w:hAnsi="Times New Roman"/>
           <w:b w:val="0"/>
           <w:i w:val="0"/>
-          <w:sz w:val="22"/>
-        </w:rPr>
-      </w:r>
-      <w:r>
-        <w:rPr>
-          <w:rFonts w:ascii="Times New Roman" w:hAnsi="Times New Roman"/>
-          <w:b/>
-          <w:i w:val="0"/>
-          <w:sz w:val="22"/>
+          <w:sz w:val="24"/>
+        </w:rPr>
+      </w:r>
+      <w:r>
+        <w:rPr>
+          <w:rFonts w:ascii="Times New Roman" w:hAnsi="Times New Roman"/>
+          <w:b/>
+          <w:i w:val="0"/>
+          <w:sz w:val="24"/>
         </w:rPr>
         <w:t>Sales &amp; Inventory Reports:</w:t>
       </w:r>
@@ -5005,7 +5021,7 @@
           <w:rFonts w:ascii="Times New Roman" w:hAnsi="Times New Roman"/>
           <w:b w:val="0"/>
           <w:i w:val="0"/>
-          <w:sz w:val="22"/>
+          <w:sz w:val="24"/>
         </w:rPr>
         <w:t xml:space="preserve"> Evaluates asset values and revenue trends to monitor cost controls.</w:t>
       </w:r>
@@ -5022,7 +5038,7 @@
           <w:rFonts w:ascii="Times New Roman" w:hAnsi="Times New Roman"/>
           <w:b w:val="0"/>
           <w:i w:val="0"/>
-          <w:sz w:val="22"/>
+          <w:sz w:val="24"/>
         </w:rPr>
         <w:t>---</w:t>
       </w:r>
@@ -5041,7 +5057,7 @@
           <w:color w:val="000000"/>
           <w:sz w:val="26"/>
         </w:rPr>
-        <w:t>6. Team Collaboration and Contribution Log (20% Weight)</w:t>
+        <w:t>6. Team Collaboration and Contribution Log</w:t>
       </w:r>
     </w:p>
     <w:p>
@@ -5073,7 +5089,7 @@
           <w:rFonts w:ascii="Times New Roman" w:hAnsi="Times New Roman"/>
           <w:b w:val="0"/>
           <w:i w:val="0"/>
-          <w:sz w:val="22"/>
+          <w:sz w:val="24"/>
         </w:rPr>
         <w:t>The team divided responsibilities across four distinct functional departments, mirroring a structured IT consultancy organization:</w:t>
       </w:r>
@@ -5096,7 +5112,7 @@
         <w:br/>
         <w:t xml:space="preserve">                         │      Project Lead        │</w:t>
         <w:br/>
-        <w:t xml:space="preserve">                         │        (P1, P2)          │</w:t>
+        <w:t xml:space="preserve">                         │   David &amp; Ruth Joy       │</w:t>
         <w:br/>
         <w:t xml:space="preserve">                         └────────────┬─────────────┘</w:t>
         <w:br/>
@@ -5108,9 +5124,9 @@
         <w:br/>
         <w:t xml:space="preserve">    ┌─────────────┐            ┌─────────────┐            ┌─────────────┐</w:t>
         <w:br/>
-        <w:t xml:space="preserve">    │ Customer Rel│            │ Operations  │            │ Development │</w:t>
+        <w:t xml:space="preserve">    │Customer Rel.│            │ Operations  │            │ Development │</w:t>
         <w:br/>
-        <w:t xml:space="preserve">    │  (P3, P4)   │            │  (P5, P6)   │            │  (P7, P8)   │</w:t>
+        <w:t xml:space="preserve">    │Brix &amp; Ydel  │            │JP &amp; VonEiron│            │Aaron &amp; Novel│</w:t>
         <w:br/>
         <w:t xml:space="preserve">    └─────────────┘            └─────────────┘            └─────────────┘</w:t>
       </w:r>
@@ -5144,7 +5160,7 @@
           <w:rFonts w:ascii="Times New Roman" w:hAnsi="Times New Roman"/>
           <w:b w:val="0"/>
           <w:i w:val="0"/>
-          <w:sz w:val="22"/>
+          <w:sz w:val="24"/>
         </w:rPr>
         <w:t>The table below outlines the primary contributions of each team member:</w:t>
       </w:r>
@@ -5156,43 +5172,14 @@
         <w:tblLook w:firstColumn="1" w:firstRow="1" w:lastColumn="0" w:lastRow="0" w:noHBand="0" w:noVBand="1" w:val="04A0"/>
       </w:tblPr>
       <w:tblGrid>
-        <w:gridCol w:w="2076"/>
-        <w:gridCol w:w="2076"/>
-        <w:gridCol w:w="2076"/>
-        <w:gridCol w:w="2076"/>
+        <w:gridCol w:w="2769"/>
+        <w:gridCol w:w="2769"/>
+        <w:gridCol w:w="2769"/>
       </w:tblGrid>
       <w:tr>
         <w:tc>
           <w:tcPr>
-            <w:tcW w:type="dxa" w:w="2076"/>
-            <w:vAlign w:val="center"/>
-            <w:shd w:val="clear" w:color="auto" w:fill="EAEAEA"/>
-            <w:tcBorders>
-              <w:top w:val="single" w:sz="4" w:space="0" w:color="CCCCCC"/>
-              <w:left w:val="single" w:sz="4" w:space="0" w:color="CCCCCC"/>
-              <w:bottom w:val="single" w:sz="4" w:space="0" w:color="CCCCCC"/>
-              <w:right w:val="single" w:sz="4" w:space="0" w:color="CCCCCC"/>
-            </w:tcBorders>
-          </w:tcPr>
-          <w:p>
-            <w:pPr>
-              <w:spacing w:before="80" w:after="80" w:line="276" w:lineRule="auto"/>
-              <w:jc w:val="left"/>
-            </w:pPr>
-            <w:r>
-              <w:rPr>
-                <w:rFonts w:ascii="Times New Roman" w:hAnsi="Times New Roman"/>
-                <w:b/>
-                <w:i w:val="0"/>
-                <w:sz w:val="20"/>
-              </w:rPr>
-              <w:t>Member Label</w:t>
-            </w:r>
-          </w:p>
-        </w:tc>
-        <w:tc>
-          <w:tcPr>
-            <w:tcW w:type="dxa" w:w="2076"/>
+            <w:tcW w:type="dxa" w:w="2769"/>
             <w:vAlign w:val="center"/>
             <w:shd w:val="clear" w:color="auto" w:fill="EAEAEA"/>
             <w:tcBorders>
@@ -5220,7 +5207,7 @@
         </w:tc>
         <w:tc>
           <w:tcPr>
-            <w:tcW w:type="dxa" w:w="2076"/>
+            <w:tcW w:type="dxa" w:w="2769"/>
             <w:vAlign w:val="center"/>
             <w:shd w:val="clear" w:color="auto" w:fill="EAEAEA"/>
             <w:tcBorders>
@@ -5248,7 +5235,7 @@
         </w:tc>
         <w:tc>
           <w:tcPr>
-            <w:tcW w:type="dxa" w:w="2076"/>
+            <w:tcW w:type="dxa" w:w="2769"/>
             <w:vAlign w:val="center"/>
             <w:shd w:val="clear" w:color="auto" w:fill="EAEAEA"/>
             <w:tcBorders>
@@ -5278,34 +5265,7 @@
       <w:tr>
         <w:tc>
           <w:tcPr>
-            <w:tcW w:type="dxa" w:w="2076"/>
-            <w:vAlign w:val="center"/>
-            <w:tcBorders>
-              <w:top w:val="single" w:sz="4" w:space="0" w:color="CCCCCC"/>
-              <w:left w:val="single" w:sz="4" w:space="0" w:color="CCCCCC"/>
-              <w:bottom w:val="single" w:sz="4" w:space="0" w:color="CCCCCC"/>
-              <w:right w:val="single" w:sz="4" w:space="0" w:color="CCCCCC"/>
-            </w:tcBorders>
-          </w:tcPr>
-          <w:p>
-            <w:pPr>
-              <w:spacing w:before="80" w:after="80" w:line="276" w:lineRule="auto"/>
-              <w:jc w:val="left"/>
-            </w:pPr>
-            <w:r>
-              <w:rPr>
-                <w:rFonts w:ascii="Times New Roman" w:hAnsi="Times New Roman"/>
-                <w:b w:val="0"/>
-                <w:i w:val="0"/>
-                <w:sz w:val="20"/>
-              </w:rPr>
-              <w:t>**P1**</w:t>
-            </w:r>
-          </w:p>
-        </w:tc>
-        <w:tc>
-          <w:tcPr>
-            <w:tcW w:type="dxa" w:w="2076"/>
+            <w:tcW w:type="dxa" w:w="2769"/>
             <w:vAlign w:val="center"/>
             <w:tcBorders>
               <w:top w:val="single" w:sz="4" w:space="0" w:color="CCCCCC"/>
@@ -5332,7 +5292,7 @@
         </w:tc>
         <w:tc>
           <w:tcPr>
-            <w:tcW w:type="dxa" w:w="2076"/>
+            <w:tcW w:type="dxa" w:w="2769"/>
             <w:vAlign w:val="center"/>
             <w:tcBorders>
               <w:top w:val="single" w:sz="4" w:space="0" w:color="CCCCCC"/>
@@ -5359,7 +5319,7 @@
         </w:tc>
         <w:tc>
           <w:tcPr>
-            <w:tcW w:type="dxa" w:w="2076"/>
+            <w:tcW w:type="dxa" w:w="2769"/>
             <w:vAlign w:val="center"/>
             <w:tcBorders>
               <w:top w:val="single" w:sz="4" w:space="0" w:color="CCCCCC"/>
@@ -5388,34 +5348,7 @@
       <w:tr>
         <w:tc>
           <w:tcPr>
-            <w:tcW w:type="dxa" w:w="2076"/>
-            <w:vAlign w:val="center"/>
-            <w:tcBorders>
-              <w:top w:val="single" w:sz="4" w:space="0" w:color="CCCCCC"/>
-              <w:left w:val="single" w:sz="4" w:space="0" w:color="CCCCCC"/>
-              <w:bottom w:val="single" w:sz="4" w:space="0" w:color="CCCCCC"/>
-              <w:right w:val="single" w:sz="4" w:space="0" w:color="CCCCCC"/>
-            </w:tcBorders>
-          </w:tcPr>
-          <w:p>
-            <w:pPr>
-              <w:spacing w:before="80" w:after="80" w:line="276" w:lineRule="auto"/>
-              <w:jc w:val="left"/>
-            </w:pPr>
-            <w:r>
-              <w:rPr>
-                <w:rFonts w:ascii="Times New Roman" w:hAnsi="Times New Roman"/>
-                <w:b w:val="0"/>
-                <w:i w:val="0"/>
-                <w:sz w:val="20"/>
-              </w:rPr>
-              <w:t>**P2**</w:t>
-            </w:r>
-          </w:p>
-        </w:tc>
-        <w:tc>
-          <w:tcPr>
-            <w:tcW w:type="dxa" w:w="2076"/>
+            <w:tcW w:type="dxa" w:w="2769"/>
             <w:vAlign w:val="center"/>
             <w:tcBorders>
               <w:top w:val="single" w:sz="4" w:space="0" w:color="CCCCCC"/>
@@ -5442,7 +5375,7 @@
         </w:tc>
         <w:tc>
           <w:tcPr>
-            <w:tcW w:type="dxa" w:w="2076"/>
+            <w:tcW w:type="dxa" w:w="2769"/>
             <w:vAlign w:val="center"/>
             <w:tcBorders>
               <w:top w:val="single" w:sz="4" w:space="0" w:color="CCCCCC"/>
@@ -5469,7 +5402,7 @@
         </w:tc>
         <w:tc>
           <w:tcPr>
-            <w:tcW w:type="dxa" w:w="2076"/>
+            <w:tcW w:type="dxa" w:w="2769"/>
             <w:vAlign w:val="center"/>
             <w:tcBorders>
               <w:top w:val="single" w:sz="4" w:space="0" w:color="CCCCCC"/>
@@ -5498,34 +5431,7 @@
       <w:tr>
         <w:tc>
           <w:tcPr>
-            <w:tcW w:type="dxa" w:w="2076"/>
-            <w:vAlign w:val="center"/>
-            <w:tcBorders>
-              <w:top w:val="single" w:sz="4" w:space="0" w:color="CCCCCC"/>
-              <w:left w:val="single" w:sz="4" w:space="0" w:color="CCCCCC"/>
-              <w:bottom w:val="single" w:sz="4" w:space="0" w:color="CCCCCC"/>
-              <w:right w:val="single" w:sz="4" w:space="0" w:color="CCCCCC"/>
-            </w:tcBorders>
-          </w:tcPr>
-          <w:p>
-            <w:pPr>
-              <w:spacing w:before="80" w:after="80" w:line="276" w:lineRule="auto"/>
-              <w:jc w:val="left"/>
-            </w:pPr>
-            <w:r>
-              <w:rPr>
-                <w:rFonts w:ascii="Times New Roman" w:hAnsi="Times New Roman"/>
-                <w:b w:val="0"/>
-                <w:i w:val="0"/>
-                <w:sz w:val="20"/>
-              </w:rPr>
-              <w:t>**P3**</w:t>
-            </w:r>
-          </w:p>
-        </w:tc>
-        <w:tc>
-          <w:tcPr>
-            <w:tcW w:type="dxa" w:w="2076"/>
+            <w:tcW w:type="dxa" w:w="2769"/>
             <w:vAlign w:val="center"/>
             <w:tcBorders>
               <w:top w:val="single" w:sz="4" w:space="0" w:color="CCCCCC"/>
@@ -5552,7 +5458,7 @@
         </w:tc>
         <w:tc>
           <w:tcPr>
-            <w:tcW w:type="dxa" w:w="2076"/>
+            <w:tcW w:type="dxa" w:w="2769"/>
             <w:vAlign w:val="center"/>
             <w:tcBorders>
               <w:top w:val="single" w:sz="4" w:space="0" w:color="CCCCCC"/>
@@ -5579,7 +5485,7 @@
         </w:tc>
         <w:tc>
           <w:tcPr>
-            <w:tcW w:type="dxa" w:w="2076"/>
+            <w:tcW w:type="dxa" w:w="2769"/>
             <w:vAlign w:val="center"/>
             <w:tcBorders>
               <w:top w:val="single" w:sz="4" w:space="0" w:color="CCCCCC"/>
@@ -5608,34 +5514,7 @@
       <w:tr>
         <w:tc>
           <w:tcPr>
-            <w:tcW w:type="dxa" w:w="2076"/>
-            <w:vAlign w:val="center"/>
-            <w:tcBorders>
-              <w:top w:val="single" w:sz="4" w:space="0" w:color="CCCCCC"/>
-              <w:left w:val="single" w:sz="4" w:space="0" w:color="CCCCCC"/>
-              <w:bottom w:val="single" w:sz="4" w:space="0" w:color="CCCCCC"/>
-              <w:right w:val="single" w:sz="4" w:space="0" w:color="CCCCCC"/>
-            </w:tcBorders>
-          </w:tcPr>
-          <w:p>
-            <w:pPr>
-              <w:spacing w:before="80" w:after="80" w:line="276" w:lineRule="auto"/>
-              <w:jc w:val="left"/>
-            </w:pPr>
-            <w:r>
-              <w:rPr>
-                <w:rFonts w:ascii="Times New Roman" w:hAnsi="Times New Roman"/>
-                <w:b w:val="0"/>
-                <w:i w:val="0"/>
-                <w:sz w:val="20"/>
-              </w:rPr>
-              <w:t>**P4**</w:t>
-            </w:r>
-          </w:p>
-        </w:tc>
-        <w:tc>
-          <w:tcPr>
-            <w:tcW w:type="dxa" w:w="2076"/>
+            <w:tcW w:type="dxa" w:w="2769"/>
             <w:vAlign w:val="center"/>
             <w:tcBorders>
               <w:top w:val="single" w:sz="4" w:space="0" w:color="CCCCCC"/>
@@ -5662,7 +5541,7 @@
         </w:tc>
         <w:tc>
           <w:tcPr>
-            <w:tcW w:type="dxa" w:w="2076"/>
+            <w:tcW w:type="dxa" w:w="2769"/>
             <w:vAlign w:val="center"/>
             <w:tcBorders>
               <w:top w:val="single" w:sz="4" w:space="0" w:color="CCCCCC"/>
@@ -5689,7 +5568,7 @@
         </w:tc>
         <w:tc>
           <w:tcPr>
-            <w:tcW w:type="dxa" w:w="2076"/>
+            <w:tcW w:type="dxa" w:w="2769"/>
             <w:vAlign w:val="center"/>
             <w:tcBorders>
               <w:top w:val="single" w:sz="4" w:space="0" w:color="CCCCCC"/>
@@ -5718,34 +5597,7 @@
       <w:tr>
         <w:tc>
           <w:tcPr>
-            <w:tcW w:type="dxa" w:w="2076"/>
-            <w:vAlign w:val="center"/>
-            <w:tcBorders>
-              <w:top w:val="single" w:sz="4" w:space="0" w:color="CCCCCC"/>
-              <w:left w:val="single" w:sz="4" w:space="0" w:color="CCCCCC"/>
-              <w:bottom w:val="single" w:sz="4" w:space="0" w:color="CCCCCC"/>
-              <w:right w:val="single" w:sz="4" w:space="0" w:color="CCCCCC"/>
-            </w:tcBorders>
-          </w:tcPr>
-          <w:p>
-            <w:pPr>
-              <w:spacing w:before="80" w:after="80" w:line="276" w:lineRule="auto"/>
-              <w:jc w:val="left"/>
-            </w:pPr>
-            <w:r>
-              <w:rPr>
-                <w:rFonts w:ascii="Times New Roman" w:hAnsi="Times New Roman"/>
-                <w:b w:val="0"/>
-                <w:i w:val="0"/>
-                <w:sz w:val="20"/>
-              </w:rPr>
-              <w:t>**P5**</w:t>
-            </w:r>
-          </w:p>
-        </w:tc>
-        <w:tc>
-          <w:tcPr>
-            <w:tcW w:type="dxa" w:w="2076"/>
+            <w:tcW w:type="dxa" w:w="2769"/>
             <w:vAlign w:val="center"/>
             <w:tcBorders>
               <w:top w:val="single" w:sz="4" w:space="0" w:color="CCCCCC"/>
@@ -5772,7 +5624,7 @@
         </w:tc>
         <w:tc>
           <w:tcPr>
-            <w:tcW w:type="dxa" w:w="2076"/>
+            <w:tcW w:type="dxa" w:w="2769"/>
             <w:vAlign w:val="center"/>
             <w:tcBorders>
               <w:top w:val="single" w:sz="4" w:space="0" w:color="CCCCCC"/>
@@ -5799,7 +5651,7 @@
         </w:tc>
         <w:tc>
           <w:tcPr>
-            <w:tcW w:type="dxa" w:w="2076"/>
+            <w:tcW w:type="dxa" w:w="2769"/>
             <w:vAlign w:val="center"/>
             <w:tcBorders>
               <w:top w:val="single" w:sz="4" w:space="0" w:color="CCCCCC"/>
@@ -5828,34 +5680,7 @@
       <w:tr>
         <w:tc>
           <w:tcPr>
-            <w:tcW w:type="dxa" w:w="2076"/>
-            <w:vAlign w:val="center"/>
-            <w:tcBorders>
-              <w:top w:val="single" w:sz="4" w:space="0" w:color="CCCCCC"/>
-              <w:left w:val="single" w:sz="4" w:space="0" w:color="CCCCCC"/>
-              <w:bottom w:val="single" w:sz="4" w:space="0" w:color="CCCCCC"/>
-              <w:right w:val="single" w:sz="4" w:space="0" w:color="CCCCCC"/>
-            </w:tcBorders>
-          </w:tcPr>
-          <w:p>
-            <w:pPr>
-              <w:spacing w:before="80" w:after="80" w:line="276" w:lineRule="auto"/>
-              <w:jc w:val="left"/>
-            </w:pPr>
-            <w:r>
-              <w:rPr>
-                <w:rFonts w:ascii="Times New Roman" w:hAnsi="Times New Roman"/>
-                <w:b w:val="0"/>
-                <w:i w:val="0"/>
-                <w:sz w:val="20"/>
-              </w:rPr>
-              <w:t>**P6**</w:t>
-            </w:r>
-          </w:p>
-        </w:tc>
-        <w:tc>
-          <w:tcPr>
-            <w:tcW w:type="dxa" w:w="2076"/>
+            <w:tcW w:type="dxa" w:w="2769"/>
             <w:vAlign w:val="center"/>
             <w:tcBorders>
               <w:top w:val="single" w:sz="4" w:space="0" w:color="CCCCCC"/>
@@ -5882,7 +5707,7 @@
         </w:tc>
         <w:tc>
           <w:tcPr>
-            <w:tcW w:type="dxa" w:w="2076"/>
+            <w:tcW w:type="dxa" w:w="2769"/>
             <w:vAlign w:val="center"/>
             <w:tcBorders>
               <w:top w:val="single" w:sz="4" w:space="0" w:color="CCCCCC"/>
@@ -5909,7 +5734,7 @@
         </w:tc>
         <w:tc>
           <w:tcPr>
-            <w:tcW w:type="dxa" w:w="2076"/>
+            <w:tcW w:type="dxa" w:w="2769"/>
             <w:vAlign w:val="center"/>
             <w:tcBorders>
               <w:top w:val="single" w:sz="4" w:space="0" w:color="CCCCCC"/>
@@ -5938,34 +5763,7 @@
       <w:tr>
         <w:tc>
           <w:tcPr>
-            <w:tcW w:type="dxa" w:w="2076"/>
-            <w:vAlign w:val="center"/>
-            <w:tcBorders>
-              <w:top w:val="single" w:sz="4" w:space="0" w:color="CCCCCC"/>
-              <w:left w:val="single" w:sz="4" w:space="0" w:color="CCCCCC"/>
-              <w:bottom w:val="single" w:sz="4" w:space="0" w:color="CCCCCC"/>
-              <w:right w:val="single" w:sz="4" w:space="0" w:color="CCCCCC"/>
-            </w:tcBorders>
-          </w:tcPr>
-          <w:p>
-            <w:pPr>
-              <w:spacing w:before="80" w:after="80" w:line="276" w:lineRule="auto"/>
-              <w:jc w:val="left"/>
-            </w:pPr>
-            <w:r>
-              <w:rPr>
-                <w:rFonts w:ascii="Times New Roman" w:hAnsi="Times New Roman"/>
-                <w:b w:val="0"/>
-                <w:i w:val="0"/>
-                <w:sz w:val="20"/>
-              </w:rPr>
-              <w:t>**P7**</w:t>
-            </w:r>
-          </w:p>
-        </w:tc>
-        <w:tc>
-          <w:tcPr>
-            <w:tcW w:type="dxa" w:w="2076"/>
+            <w:tcW w:type="dxa" w:w="2769"/>
             <w:vAlign w:val="center"/>
             <w:tcBorders>
               <w:top w:val="single" w:sz="4" w:space="0" w:color="CCCCCC"/>
@@ -5992,7 +5790,7 @@
         </w:tc>
         <w:tc>
           <w:tcPr>
-            <w:tcW w:type="dxa" w:w="2076"/>
+            <w:tcW w:type="dxa" w:w="2769"/>
             <w:vAlign w:val="center"/>
             <w:tcBorders>
               <w:top w:val="single" w:sz="4" w:space="0" w:color="CCCCCC"/>
@@ -6019,7 +5817,7 @@
         </w:tc>
         <w:tc>
           <w:tcPr>
-            <w:tcW w:type="dxa" w:w="2076"/>
+            <w:tcW w:type="dxa" w:w="2769"/>
             <w:vAlign w:val="center"/>
             <w:tcBorders>
               <w:top w:val="single" w:sz="4" w:space="0" w:color="CCCCCC"/>
@@ -6048,34 +5846,7 @@
       <w:tr>
         <w:tc>
           <w:tcPr>
-            <w:tcW w:type="dxa" w:w="2076"/>
-            <w:vAlign w:val="center"/>
-            <w:tcBorders>
-              <w:top w:val="single" w:sz="4" w:space="0" w:color="CCCCCC"/>
-              <w:left w:val="single" w:sz="4" w:space="0" w:color="CCCCCC"/>
-              <w:bottom w:val="single" w:sz="4" w:space="0" w:color="CCCCCC"/>
-              <w:right w:val="single" w:sz="4" w:space="0" w:color="CCCCCC"/>
-            </w:tcBorders>
-          </w:tcPr>
-          <w:p>
-            <w:pPr>
-              <w:spacing w:before="80" w:after="80" w:line="276" w:lineRule="auto"/>
-              <w:jc w:val="left"/>
-            </w:pPr>
-            <w:r>
-              <w:rPr>
-                <w:rFonts w:ascii="Times New Roman" w:hAnsi="Times New Roman"/>
-                <w:b w:val="0"/>
-                <w:i w:val="0"/>
-                <w:sz w:val="20"/>
-              </w:rPr>
-              <w:t>**P8**</w:t>
-            </w:r>
-          </w:p>
-        </w:tc>
-        <w:tc>
-          <w:tcPr>
-            <w:tcW w:type="dxa" w:w="2076"/>
+            <w:tcW w:type="dxa" w:w="2769"/>
             <w:vAlign w:val="center"/>
             <w:tcBorders>
               <w:top w:val="single" w:sz="4" w:space="0" w:color="CCCCCC"/>
@@ -6102,7 +5873,7 @@
         </w:tc>
         <w:tc>
           <w:tcPr>
-            <w:tcW w:type="dxa" w:w="2076"/>
+            <w:tcW w:type="dxa" w:w="2769"/>
             <w:vAlign w:val="center"/>
             <w:tcBorders>
               <w:top w:val="single" w:sz="4" w:space="0" w:color="CCCCCC"/>
@@ -6129,7 +5900,7 @@
         </w:tc>
         <w:tc>
           <w:tcPr>
-            <w:tcW w:type="dxa" w:w="2076"/>
+            <w:tcW w:type="dxa" w:w="2769"/>
             <w:vAlign w:val="center"/>
             <w:tcBorders>
               <w:top w:val="single" w:sz="4" w:space="0" w:color="CCCCCC"/>
@@ -6191,7 +5962,7 @@
           <w:rFonts w:ascii="Times New Roman" w:hAnsi="Times New Roman"/>
           <w:b w:val="0"/>
           <w:i w:val="0"/>
-          <w:sz w:val="22"/>
+          <w:sz w:val="24"/>
         </w:rPr>
         <w:t>The project was executed using Agile software development methodologies:</w:t>
       </w:r>
@@ -6207,7 +5978,7 @@
           <w:rFonts w:ascii="Times New Roman" w:hAnsi="Times New Roman"/>
           <w:b w:val="0"/>
           <w:i w:val="0"/>
-          <w:sz w:val="22"/>
+          <w:sz w:val="24"/>
         </w:rPr>
         <w:t xml:space="preserve">•  </w:t>
       </w:r>
@@ -6216,15 +5987,15 @@
           <w:rFonts w:ascii="Times New Roman" w:hAnsi="Times New Roman"/>
           <w:b w:val="0"/>
           <w:i w:val="0"/>
-          <w:sz w:val="22"/>
-        </w:rPr>
-      </w:r>
-      <w:r>
-        <w:rPr>
-          <w:rFonts w:ascii="Times New Roman" w:hAnsi="Times New Roman"/>
-          <w:b/>
-          <w:i w:val="0"/>
-          <w:sz w:val="22"/>
+          <w:sz w:val="24"/>
+        </w:rPr>
+      </w:r>
+      <w:r>
+        <w:rPr>
+          <w:rFonts w:ascii="Times New Roman" w:hAnsi="Times New Roman"/>
+          <w:b/>
+          <w:i w:val="0"/>
+          <w:sz w:val="24"/>
         </w:rPr>
         <w:t>Requirements Gathering:</w:t>
       </w:r>
@@ -6233,7 +6004,7 @@
           <w:rFonts w:ascii="Times New Roman" w:hAnsi="Times New Roman"/>
           <w:b w:val="0"/>
           <w:i w:val="0"/>
-          <w:sz w:val="22"/>
+          <w:sz w:val="24"/>
         </w:rPr>
         <w:t xml:space="preserve"> The Project Management and Customer Relations departments gathered requirements from the florist client.</w:t>
       </w:r>
@@ -6249,7 +6020,7 @@
           <w:rFonts w:ascii="Times New Roman" w:hAnsi="Times New Roman"/>
           <w:b w:val="0"/>
           <w:i w:val="0"/>
-          <w:sz w:val="22"/>
+          <w:sz w:val="24"/>
         </w:rPr>
         <w:t xml:space="preserve">•  </w:t>
       </w:r>
@@ -6258,15 +6029,15 @@
           <w:rFonts w:ascii="Times New Roman" w:hAnsi="Times New Roman"/>
           <w:b w:val="0"/>
           <w:i w:val="0"/>
-          <w:sz w:val="22"/>
-        </w:rPr>
-      </w:r>
-      <w:r>
-        <w:rPr>
-          <w:rFonts w:ascii="Times New Roman" w:hAnsi="Times New Roman"/>
-          <w:b/>
-          <w:i w:val="0"/>
-          <w:sz w:val="22"/>
+          <w:sz w:val="24"/>
+        </w:rPr>
+      </w:r>
+      <w:r>
+        <w:rPr>
+          <w:rFonts w:ascii="Times New Roman" w:hAnsi="Times New Roman"/>
+          <w:b/>
+          <w:i w:val="0"/>
+          <w:sz w:val="24"/>
         </w:rPr>
         <w:t>Iterative Sprints:</w:t>
       </w:r>
@@ -6275,7 +6046,7 @@
           <w:rFonts w:ascii="Times New Roman" w:hAnsi="Times New Roman"/>
           <w:b w:val="0"/>
           <w:i w:val="0"/>
-          <w:sz w:val="22"/>
+          <w:sz w:val="24"/>
         </w:rPr>
         <w:t xml:space="preserve"> The Development department implemented features in weekly sprints, prioritizing critical paths (Storefront → Checkout → Admin Control → Reporting).</w:t>
       </w:r>
@@ -6291,7 +6062,7 @@
           <w:rFonts w:ascii="Times New Roman" w:hAnsi="Times New Roman"/>
           <w:b w:val="0"/>
           <w:i w:val="0"/>
-          <w:sz w:val="22"/>
+          <w:sz w:val="24"/>
         </w:rPr>
         <w:t xml:space="preserve">•  </w:t>
       </w:r>
@@ -6300,15 +6071,15 @@
           <w:rFonts w:ascii="Times New Roman" w:hAnsi="Times New Roman"/>
           <w:b w:val="0"/>
           <w:i w:val="0"/>
-          <w:sz w:val="22"/>
-        </w:rPr>
-      </w:r>
-      <w:r>
-        <w:rPr>
-          <w:rFonts w:ascii="Times New Roman" w:hAnsi="Times New Roman"/>
-          <w:b/>
-          <w:i w:val="0"/>
-          <w:sz w:val="22"/>
+          <w:sz w:val="24"/>
+        </w:rPr>
+      </w:r>
+      <w:r>
+        <w:rPr>
+          <w:rFonts w:ascii="Times New Roman" w:hAnsi="Times New Roman"/>
+          <w:b/>
+          <w:i w:val="0"/>
+          <w:sz w:val="24"/>
         </w:rPr>
         <w:t>System Auditing:</w:t>
       </w:r>
@@ -6317,7 +6088,7 @@
           <w:rFonts w:ascii="Times New Roman" w:hAnsi="Times New Roman"/>
           <w:b w:val="0"/>
           <w:i w:val="0"/>
-          <w:sz w:val="22"/>
+          <w:sz w:val="24"/>
         </w:rPr>
         <w:t xml:space="preserve"> The Operations department ran tests on reporting logic and database writes to verify accuracy before final integration.</w:t>
       </w:r>
@@ -6333,7 +6104,7 @@
           <w:rFonts w:ascii="Times New Roman" w:hAnsi="Times New Roman"/>
           <w:b w:val="0"/>
           <w:i w:val="0"/>
-          <w:sz w:val="22"/>
+          <w:sz w:val="24"/>
         </w:rPr>
         <w:t xml:space="preserve">•  </w:t>
       </w:r>
@@ -6342,15 +6113,15 @@
           <w:rFonts w:ascii="Times New Roman" w:hAnsi="Times New Roman"/>
           <w:b w:val="0"/>
           <w:i w:val="0"/>
-          <w:sz w:val="22"/>
-        </w:rPr>
-      </w:r>
-      <w:r>
-        <w:rPr>
-          <w:rFonts w:ascii="Times New Roman" w:hAnsi="Times New Roman"/>
-          <w:b/>
-          <w:i w:val="0"/>
-          <w:sz w:val="22"/>
+          <w:sz w:val="24"/>
+        </w:rPr>
+      </w:r>
+      <w:r>
+        <w:rPr>
+          <w:rFonts w:ascii="Times New Roman" w:hAnsi="Times New Roman"/>
+          <w:b/>
+          <w:i w:val="0"/>
+          <w:sz w:val="24"/>
         </w:rPr>
         <w:t>Security &amp; QA Reviews:</w:t>
       </w:r>
@@ -6359,7 +6130,7 @@
           <w:rFonts w:ascii="Times New Roman" w:hAnsi="Times New Roman"/>
           <w:b w:val="0"/>
           <w:i w:val="0"/>
-          <w:sz w:val="22"/>
+          <w:sz w:val="24"/>
         </w:rPr>
         <w:t xml:space="preserve"> The Development team audited the system for common vulnerabilities, testing database transaction rollbacks and price tampering guards.</w:t>
       </w:r>
@@ -6376,7 +6147,7 @@
           <w:rFonts w:ascii="Times New Roman" w:hAnsi="Times New Roman"/>
           <w:b w:val="0"/>
           <w:i w:val="0"/>
-          <w:sz w:val="22"/>
+          <w:sz w:val="24"/>
         </w:rPr>
         <w:t>---</w:t>
       </w:r>
@@ -6411,7 +6182,7 @@
           <w:rFonts w:ascii="Times New Roman" w:hAnsi="Times New Roman"/>
           <w:b w:val="0"/>
           <w:i w:val="0"/>
-          <w:sz w:val="22"/>
+          <w:sz w:val="24"/>
         </w:rPr>
         <w:t>PureBlooms demonstrates how software engineering can address operational challenges in small-scale retail businesses. By replacing manual workflows with structured digital processes, the system establishes a framework that supports the core functions of Organizational Management (OM).</w:t>
       </w:r>
@@ -6428,7 +6199,7 @@
           <w:rFonts w:ascii="Times New Roman" w:hAnsi="Times New Roman"/>
           <w:b w:val="0"/>
           <w:i w:val="0"/>
-          <w:sz w:val="22"/>
+          <w:sz w:val="24"/>
         </w:rPr>
         <w:t xml:space="preserve">For the business owner, the platform provides the </w:t>
       </w:r>
@@ -6437,7 +6208,7 @@
           <w:rFonts w:ascii="Times New Roman" w:hAnsi="Times New Roman"/>
           <w:b/>
           <w:i w:val="0"/>
-          <w:sz w:val="22"/>
+          <w:sz w:val="24"/>
         </w:rPr>
         <w:t>control</w:t>
       </w:r>
@@ -6446,7 +6217,7 @@
           <w:rFonts w:ascii="Times New Roman" w:hAnsi="Times New Roman"/>
           <w:b w:val="0"/>
           <w:i w:val="0"/>
-          <w:sz w:val="22"/>
+          <w:sz w:val="24"/>
         </w:rPr>
         <w:t xml:space="preserve"> needed to manage inventory, track order lifecycles, and analyze sales performance. For the customer, it delivers a transparent and user-friendly shopping experience. Through security safeguards, transaction rollbacks, and a containerized environment, PureBlooms offers a robust, production-ready solution that bridges the gap between software development and business operations.</w:t>
       </w:r>

</xml_diff>

<commit_message>
docs: remove heading numbering, add TOC, fix conclusion spacing, and render team structure diagram
</commit_message>
<xml_diff>
--- a/org-management-presentation/PureBlooms_Developed_System_Documentation.docx
+++ b/org-management-presentation/PureBlooms_Developed_System_Documentation.docx
@@ -991,6 +991,35 @@
     </w:p>
     <w:p>
       <w:pPr>
+        <w:pageBreakBefore/>
+        <w:spacing w:before="480" w:after="240"/>
+        <w:jc w:val="center"/>
+      </w:pPr>
+      <w:r>
+        <w:rPr>
+          <w:rFonts w:ascii="Times New Roman" w:hAnsi="Times New Roman"/>
+          <w:b/>
+          <w:i w:val="0"/>
+          <w:sz w:val="28"/>
+        </w:rPr>
+        <w:t>Table of Contents</w:t>
+      </w:r>
+    </w:p>
+    <w:p>
+      <w:pPr>
+        <w:spacing w:after="240"/>
+        <w:jc w:val="center"/>
+      </w:pPr>
+      <w:fldChar w:fldCharType="begin"/>
+      <w:instrText xml:space="preserve">TOC \o "1-3" \h \z \u</w:instrText>
+      <w:fldChar w:fldCharType="separate"/>
+      <w:r>
+        <w:t>[Right-click here and select 'Update Field' to generate the Table of Contents]</w:t>
+      </w:r>
+      <w:fldChar w:fldCharType="end"/>
+    </w:p>
+    <w:p>
+      <w:pPr>
         <w:pStyle w:val="Heading3"/>
         <w:keepNext/>
         <w:pageBreakBefore/>
@@ -1143,7 +1172,7 @@
           <w:color w:val="000000"/>
           <w:sz w:val="26"/>
         </w:rPr>
-        <w:t>1. Project Background and Core Business Problem</w:t>
+        <w:t>Project Background and Core Business Problem</w:t>
       </w:r>
     </w:p>
     <w:p>
@@ -1160,7 +1189,7 @@
           <w:color w:val="000000"/>
           <w:sz w:val="24"/>
         </w:rPr>
-        <w:t>1.1 Organizational Frame (Agile IT Consultancy Structure)</w:t>
+        <w:t>Organizational Frame (Agile IT Consultancy Structure)</w:t>
       </w:r>
     </w:p>
     <w:p>
@@ -1380,7 +1409,7 @@
           <w:color w:val="000000"/>
           <w:sz w:val="24"/>
         </w:rPr>
-        <w:t>1.2 The Client Case Study</w:t>
+        <w:t>The Client Case Study</w:t>
       </w:r>
     </w:p>
     <w:p>
@@ -1539,7 +1568,7 @@
           <w:color w:val="000000"/>
           <w:sz w:val="24"/>
         </w:rPr>
-        <w:t>1.3 System Classification</w:t>
+        <w:t>System Classification</w:t>
       </w:r>
     </w:p>
     <w:p>
@@ -1608,7 +1637,7 @@
           <w:color w:val="000000"/>
           <w:sz w:val="26"/>
         </w:rPr>
-        <w:t>2. System Architecture &amp; Technical Design</w:t>
+        <w:t>System Architecture &amp; Technical Design</w:t>
       </w:r>
     </w:p>
     <w:p>
@@ -1625,7 +1654,7 @@
           <w:color w:val="000000"/>
           <w:sz w:val="24"/>
         </w:rPr>
-        <w:t>2.1 Model-View-Controller (MVC) Pattern</w:t>
+        <w:t>Model-View-Controller (MVC) Pattern</w:t>
       </w:r>
     </w:p>
     <w:p>
@@ -1861,7 +1890,7 @@
           <w:color w:val="000000"/>
           <w:sz w:val="24"/>
         </w:rPr>
-        <w:t>2.2 Entity Relationship Diagram (ERD) Outline</w:t>
+        <w:t>Entity Relationship Diagram (ERD) Outline</w:t>
       </w:r>
     </w:p>
     <w:p>
@@ -2206,7 +2235,7 @@
           <w:color w:val="000000"/>
           <w:sz w:val="26"/>
         </w:rPr>
-        <w:t>3. System Functionality &amp; Design</w:t>
+        <w:t>System Functionality &amp; Design</w:t>
       </w:r>
     </w:p>
     <w:p>
@@ -2240,7 +2269,7 @@
           <w:color w:val="000000"/>
           <w:sz w:val="24"/>
         </w:rPr>
-        <w:t>3.1 Customer Storefront Module</w:t>
+        <w:t>Customer Storefront Module</w:t>
       </w:r>
     </w:p>
     <w:p>
@@ -2274,7 +2303,7 @@
           <w:color w:val="000000"/>
           <w:sz w:val="24"/>
         </w:rPr>
-        <w:t>3.1.1 Interactive Storefront Homepage</w:t>
+        <w:t>Interactive Storefront Homepage</w:t>
       </w:r>
     </w:p>
     <w:p>
@@ -2434,7 +2463,7 @@
           <w:color w:val="000000"/>
           <w:sz w:val="24"/>
         </w:rPr>
-        <w:t>3.1.2 Cart &amp; Checkout Workflow</w:t>
+        <w:t>Cart &amp; Checkout Workflow</w:t>
       </w:r>
     </w:p>
     <w:p>
@@ -2654,7 +2683,7 @@
           <w:color w:val="000000"/>
           <w:sz w:val="24"/>
         </w:rPr>
-        <w:t>3.1.3 Order Tracking and Timeline</w:t>
+        <w:t>Order Tracking and Timeline</w:t>
       </w:r>
     </w:p>
     <w:p>
@@ -2831,7 +2860,7 @@
           <w:color w:val="000000"/>
           <w:sz w:val="24"/>
         </w:rPr>
-        <w:t>3.2 Operations Center (Admin Panel)</w:t>
+        <w:t>Operations Center (Admin Panel)</w:t>
       </w:r>
     </w:p>
     <w:p>
@@ -2865,7 +2894,7 @@
           <w:color w:val="000000"/>
           <w:sz w:val="24"/>
         </w:rPr>
-        <w:t>3.2.1 Real-Time KPI Dashboard</w:t>
+        <w:t>Real-Time KPI Dashboard</w:t>
       </w:r>
     </w:p>
     <w:p>
@@ -3025,7 +3054,7 @@
           <w:color w:val="000000"/>
           <w:sz w:val="24"/>
         </w:rPr>
-        <w:t>3.2.2 Order Pipeline Management</w:t>
+        <w:t>Order Pipeline Management</w:t>
       </w:r>
     </w:p>
     <w:p>
@@ -3185,7 +3214,7 @@
           <w:color w:val="000000"/>
           <w:sz w:val="24"/>
         </w:rPr>
-        <w:t>3.2.3 Sales, Inventory &amp; CRM Reporting</w:t>
+        <w:t>Sales, Inventory &amp; CRM Reporting</w:t>
       </w:r>
     </w:p>
     <w:p>
@@ -3429,7 +3458,7 @@
           <w:color w:val="000000"/>
           <w:sz w:val="24"/>
         </w:rPr>
-        <w:t>3.2.4 Shop Settings and Maintenance Mode</w:t>
+        <w:t>Shop Settings and Maintenance Mode</w:t>
       </w:r>
     </w:p>
     <w:p>
@@ -3606,7 +3635,7 @@
           <w:color w:val="000000"/>
           <w:sz w:val="24"/>
         </w:rPr>
-        <w:t>3.3 UI/UX Design Philosophy</w:t>
+        <w:t>UI/UX Design Philosophy</w:t>
       </w:r>
     </w:p>
     <w:p>
@@ -3808,7 +3837,7 @@
           <w:color w:val="000000"/>
           <w:sz w:val="26"/>
         </w:rPr>
-        <w:t>4. Problem-Solving, Security &amp; Non-Functional Innovations</w:t>
+        <w:t>Problem-Solving, Security &amp; Non-Functional Innovations</w:t>
       </w:r>
     </w:p>
     <w:p>
@@ -3842,7 +3871,7 @@
           <w:color w:val="000000"/>
           <w:sz w:val="24"/>
         </w:rPr>
-        <w:t>4.1 Database Transactions for Data Integrity</w:t>
+        <w:t>Database Transactions for Data Integrity</w:t>
       </w:r>
     </w:p>
     <w:p>
@@ -3943,7 +3972,7 @@
           <w:color w:val="000000"/>
           <w:sz w:val="24"/>
         </w:rPr>
-        <w:t>4.2 Server-Side Security Validation (Price Protection)</w:t>
+        <w:t>Server-Side Security Validation (Price Protection)</w:t>
       </w:r>
     </w:p>
     <w:p>
@@ -4044,7 +4073,7 @@
           <w:color w:val="000000"/>
           <w:sz w:val="24"/>
         </w:rPr>
-        <w:t>4.3 Brute-Force Mitigation</w:t>
+        <w:t>Brute-Force Mitigation</w:t>
       </w:r>
     </w:p>
     <w:p>
@@ -4145,7 +4174,7 @@
           <w:color w:val="000000"/>
           <w:sz w:val="24"/>
         </w:rPr>
-        <w:t>4.4 Duplicate Order Prevention (Cart Session Tokens)</w:t>
+        <w:t>Duplicate Order Prevention (Cart Session Tokens)</w:t>
       </w:r>
     </w:p>
     <w:p>
@@ -4246,7 +4275,7 @@
           <w:color w:val="000000"/>
           <w:sz w:val="24"/>
         </w:rPr>
-        <w:t>4.5 Settings Cache &amp; Maintenance Mode Middleware</w:t>
+        <w:t>Settings Cache &amp; Maintenance Mode Middleware</w:t>
       </w:r>
     </w:p>
     <w:p>
@@ -4364,24 +4393,7 @@
           <w:color w:val="000000"/>
           <w:sz w:val="26"/>
         </w:rPr>
-        <w:t>5. Organizational Management (OM) Integration</w:t>
-      </w:r>
-    </w:p>
-    <w:p>
-      <w:pPr>
-        <w:pStyle w:val="BodyText"/>
-        <w:spacing w:before="0" w:after="120" w:line="360" w:lineRule="auto"/>
-        <w:ind w:firstLine="720"/>
-        <w:jc w:val="both"/>
-      </w:pPr>
-      <w:r>
-        <w:rPr>
-          <w:rFonts w:ascii="Times New Roman" w:hAnsi="Times New Roman"/>
-          <w:b w:val="0"/>
-          <w:i w:val="0"/>
-          <w:sz w:val="24"/>
-        </w:rPr>
-        <w:t>PureBlooms is designed around the four primary functions of Organizational Management.</w:t>
+        <w:t>Organizational Management (OM) Integration</w:t>
       </w:r>
     </w:p>
     <w:p>
@@ -4456,7 +4468,7 @@
           <w:color w:val="000000"/>
           <w:sz w:val="24"/>
         </w:rPr>
-        <w:t>5.1 Planning Function</w:t>
+        <w:t>Planning Function</w:t>
       </w:r>
     </w:p>
     <w:p>
@@ -4575,7 +4587,7 @@
           <w:color w:val="000000"/>
           <w:sz w:val="24"/>
         </w:rPr>
-        <w:t>5.2 Organizing Function</w:t>
+        <w:t>Organizing Function</w:t>
       </w:r>
     </w:p>
     <w:p>
@@ -4694,7 +4706,7 @@
           <w:color w:val="000000"/>
           <w:sz w:val="24"/>
         </w:rPr>
-        <w:t>5.3 Leading Function</w:t>
+        <w:t>Leading Function</w:t>
       </w:r>
     </w:p>
     <w:p>
@@ -4813,7 +4825,7 @@
           <w:color w:val="000000"/>
           <w:sz w:val="24"/>
         </w:rPr>
-        <w:t>5.4 Controlling Function</w:t>
+        <w:t>Controlling Function</w:t>
       </w:r>
     </w:p>
     <w:p>
@@ -5057,7 +5069,7 @@
           <w:color w:val="000000"/>
           <w:sz w:val="26"/>
         </w:rPr>
-        <w:t>6. Team Collaboration and Contribution Log</w:t>
+        <w:t>Team Collaboration and Contribution Log</w:t>
       </w:r>
     </w:p>
     <w:p>
@@ -5074,7 +5086,7 @@
           <w:color w:val="000000"/>
           <w:sz w:val="24"/>
         </w:rPr>
-        <w:t>6.1 Team Organizational Structure</w:t>
+        <w:t>Team Organizational Structure</w:t>
       </w:r>
     </w:p>
     <w:p>
@@ -5096,39 +5108,60 @@
     </w:p>
     <w:p>
       <w:pPr>
-        <w:spacing w:before="120" w:after="120" w:line="240" w:lineRule="auto"/>
-        <w:ind w:left="720"/>
-        <w:jc w:val="left"/>
-      </w:pPr>
-      <w:r>
-        <w:rPr>
-          <w:rFonts w:ascii="Consolas" w:hAnsi="Consolas"/>
-          <w:b w:val="0"/>
-          <w:i w:val="0"/>
+        <w:keepNext/>
+        <w:spacing w:before="240" w:after="80"/>
+        <w:jc w:val="center"/>
+      </w:pPr>
+      <w:r>
+        <w:drawing>
+          <wp:inline xmlns:a="http://schemas.openxmlformats.org/drawingml/2006/main">
+            <wp:extent cx="4572000" cy="1292973"/>
+            <wp:docPr id="3" name="Picture 3"/>
+            <wp:cNvGraphicFramePr>
+              <a:graphicFrameLocks noChangeAspect="1"/>
+            </wp:cNvGraphicFramePr>
+            <a:graphic>
+              <a:graphicData uri="http://schemas.openxmlformats.org/drawingml/2006/picture">
+                <pic:pic>
+                  <pic:nvPicPr>
+                    <pic:cNvPr id="0" name="team_structure_diagram.png"/>
+                    <pic:cNvPicPr/>
+                  </pic:nvPicPr>
+                  <pic:blipFill>
+                    <a:blip r:embed="rId18"/>
+                    <a:stretch>
+                      <a:fillRect/>
+                    </a:stretch>
+                  </pic:blipFill>
+                  <pic:spPr>
+                    <a:xfrm>
+                      <a:off x="0" y="0"/>
+                      <a:ext cx="4572000" cy="1292973"/>
+                    </a:xfrm>
+                    <a:prstGeom prst="rect"/>
+                  </pic:spPr>
+                </pic:pic>
+              </a:graphicData>
+            </a:graphic>
+          </wp:inline>
+        </w:drawing>
+      </w:r>
+    </w:p>
+    <w:p>
+      <w:pPr>
+        <w:keepNext w:val="0"/>
+        <w:spacing w:before="40" w:after="240"/>
+        <w:jc w:val="center"/>
+      </w:pPr>
+      <w:r>
+        <w:rPr>
+          <w:rFonts w:ascii="Times New Roman" w:hAnsi="Times New Roman"/>
+          <w:b w:val="0"/>
+          <w:i/>
           <w:color w:val="505050"/>
-          <w:sz w:val="19"/>
-        </w:rPr>
-        <w:t xml:space="preserve">                         ┌──────────────────────────┐</w:t>
-        <w:br/>
-        <w:t xml:space="preserve">                         │      Project Lead        │</w:t>
-        <w:br/>
-        <w:t xml:space="preserve">                         │   David &amp; Ruth Joy       │</w:t>
-        <w:br/>
-        <w:t xml:space="preserve">                         └────────────┬─────────────┘</w:t>
-        <w:br/>
-        <w:t xml:space="preserve">                                      │</w:t>
-        <w:br/>
-        <w:t xml:space="preserve">           ┌──────────────────────────┼──────────────────────────┐</w:t>
-        <w:br/>
-        <w:t xml:space="preserve">           ▼                          ▼                          ▼</w:t>
-        <w:br/>
-        <w:t xml:space="preserve">    ┌─────────────┐            ┌─────────────┐            ┌─────────────┐</w:t>
-        <w:br/>
-        <w:t xml:space="preserve">    │Customer Rel.│            │ Operations  │            │ Development │</w:t>
-        <w:br/>
-        <w:t xml:space="preserve">    │Brix &amp; Ydel  │            │JP &amp; VonEiron│            │Aaron &amp; Novel│</w:t>
-        <w:br/>
-        <w:t xml:space="preserve">    └─────────────┘            └─────────────┘            └─────────────┘</w:t>
+          <w:sz w:val="20"/>
+        </w:rPr>
+        <w:t>Figure: Team Organizational Structure</w:t>
       </w:r>
     </w:p>
     <w:p>
@@ -5145,7 +5178,7 @@
           <w:color w:val="000000"/>
           <w:sz w:val="24"/>
         </w:rPr>
-        <w:t>6.2 Individual Contributions Log</w:t>
+        <w:t>Individual Contributions Log</w:t>
       </w:r>
     </w:p>
     <w:p>
@@ -5947,7 +5980,7 @@
           <w:color w:val="000000"/>
           <w:sz w:val="24"/>
         </w:rPr>
-        <w:t>6.3 Collaboration Methodology</w:t>
+        <w:t>Collaboration Methodology</w:t>
       </w:r>
     </w:p>
     <w:p>
@@ -6156,7 +6189,6 @@
       <w:pPr>
         <w:pStyle w:val="Heading3"/>
         <w:keepNext/>
-        <w:pageBreakBefore/>
         <w:spacing w:before="240" w:after="120"/>
       </w:pPr>
       <w:r>
@@ -6167,7 +6199,7 @@
           <w:color w:val="000000"/>
           <w:sz w:val="26"/>
         </w:rPr>
-        <w:t>7. Conclusion</w:t>
+        <w:t>Conclusion</w:t>
       </w:r>
     </w:p>
     <w:p>

</xml_diff>

<commit_message>
docs: audit and remove AI writing tells (AI-isms) from MD and DOCX files
</commit_message>
<xml_diff>
--- a/org-management-presentation/PureBlooms_Developed_System_Documentation.docx
+++ b/org-management-presentation/PureBlooms_Developed_System_Documentation.docx
@@ -1033,7 +1033,7 @@
           <w:color w:val="000000"/>
           <w:sz w:val="26"/>
         </w:rPr>
-        <w:t>📌 Executive Summary</w:t>
+        <w:t>Executive Summary</w:t>
       </w:r>
     </w:p>
     <w:p>
@@ -1120,7 +1120,7 @@
           <w:i w:val="0"/>
           <w:sz w:val="24"/>
         </w:rPr>
-        <w:t>By integrating management theory directly into system features, PureBlooms enforces the four core management functions—</w:t>
+        <w:t xml:space="preserve">By integrating management theory directly into system features, PureBlooms enforces the four core management functions: </w:t>
       </w:r>
       <w:r>
         <w:rPr>
@@ -1138,7 +1138,7 @@
           <w:i w:val="0"/>
           <w:sz w:val="24"/>
         </w:rPr>
-        <w:t>—transforming chaotic workflows into structured, auditable business processes.</w:t>
+        <w:t>. This structures chaotic workflows into auditable business processes.</w:t>
       </w:r>
     </w:p>
     <w:p>
@@ -2877,7 +2877,7 @@
           <w:i w:val="0"/>
           <w:sz w:val="24"/>
         </w:rPr>
-        <w:t>The administrative portal serves as the business's central command center, offering tools to manage operations and monitor performance.</w:t>
+        <w:t>The administrative portal is the business's central command center, offering tools to manage operations and monitor performance.</w:t>
       </w:r>
     </w:p>
     <w:p>
@@ -3803,7 +3803,7 @@
           <w:i w:val="0"/>
           <w:sz w:val="24"/>
         </w:rPr>
-        <w:t xml:space="preserve"> Employs CSS Flexbox and Grid layouts to ensure the storefront functions seamlessly on mobile devices, tablets, and desktop displays.</w:t>
+        <w:t xml:space="preserve"> Employs CSS Flexbox and Grid layouts to ensure the storefront functions smoothly on mobile devices, tablets, and desktop displays.</w:t>
       </w:r>
     </w:p>
     <w:p>
@@ -6251,7 +6251,7 @@
           <w:i w:val="0"/>
           <w:sz w:val="24"/>
         </w:rPr>
-        <w:t xml:space="preserve"> needed to manage inventory, track order lifecycles, and analyze sales performance. For the customer, it delivers a transparent and user-friendly shopping experience. Through security safeguards, transaction rollbacks, and a containerized environment, PureBlooms offers a robust, production-ready solution that bridges the gap between software development and business operations.</w:t>
+        <w:t xml:space="preserve"> needed to manage inventory, track order lifecycles, and analyze sales performance. For the customer, it delivers a transparent and user-friendly shopping experience. Through security safeguards, transaction rollbacks, and a containerized environment, PureBlooms offers a stable, production-ready solution that bridges the gap between software development and business operations.</w:t>
       </w:r>
     </w:p>
     <w:sectPr>

</xml_diff>

<commit_message>
docs: remove remaining em-dashes and AI-isms from presentation and documentation
</commit_message>
<xml_diff>
--- a/org-management-presentation/PureBlooms_Developed_System_Documentation.docx
+++ b/org-management-presentation/PureBlooms_Developed_System_Documentation.docx
@@ -3197,7 +3197,7 @@
         </w:rPr>
         <w:t xml:space="preserve">  [SCREENSHOT PLACEHOLDER: admin_order_pipeline.png]</w:t>
         <w:br/>
-        <w:t xml:space="preserve">  Caption: Admin order list interface showcasing filter tabs, action buttons, and status badge indicators.</w:t>
+        <w:t xml:space="preserve">  Caption: Admin order list interface showing filter tabs, action buttons, and status badge indicators.</w:t>
       </w:r>
     </w:p>
     <w:p>
@@ -5871,7 +5871,7 @@
                 <w:i w:val="0"/>
                 <w:sz w:val="20"/>
               </w:rPr>
-              <w:t>Serves as Lead Developer. Manages repository operations, oversees the Laravel codebase, and implements MVC architecture.</w:t>
+              <w:t>Lead developer. Manages repository operations, oversees the Laravel codebase, and implements MVC architecture.</w:t>
             </w:r>
           </w:p>
         </w:tc>
@@ -5954,7 +5954,7 @@
                 <w:i w:val="0"/>
                 <w:sz w:val="20"/>
               </w:rPr>
-              <w:t>Functions as Security Architect. Implements rate limiters, verifies database transaction safety, and configures route middleware protections.</w:t>
+              <w:t>Security architect. Implements rate limiters, verifies database transaction safety, and configures route middleware protections.</w:t>
             </w:r>
           </w:p>
         </w:tc>

</xml_diff>